<commit_message>
Cite 30 sources, 28 of them from 2024 to 2026.
Each new Elsevier, IEEE, and MDPI paper is cited for the credit, cost, or decision-support claim it actually makes. The 2009 UCI deposit stays because it is the data file.

Co-authored-by: pravallikanalluri9848 <pravallikanalluri9848@gmail.com>
</commit_message>
<xml_diff>
--- a/Nalluri_KBS_SourceFile.docx
+++ b/Nalluri_KBS_SourceFile.docx
@@ -251,7 +251,7 @@
           <w:i w:val="0"/>
           <w:sz w:val="24"/>
         </w:rPr>
-        <w:t>Knowledge-based systems support a human decision, not only a ranked score. In credit, a probability of default is not itself an action. When a missed default and a false alarm have different costs, the operating threshold is part of the decision [3,4]. Model comparison is already a large literature [2]. This short communication does not add another accuracy contest. It states a cost ratio as the knowledge a lender writes down, and it turns that ratio into a threshold another person can inspect [1].</w:t>
+        <w:t>Knowledge-based systems support a human decision, not only a ranked score. In credit, a probability of default is not itself an action. Decision-support credit scoring and automatic threshold learning already treat that action as the object to be chosen [1,2], and misclassification costs can be turned into explicit rules and trees [3]. This short communication keeps a simpler piece of knowledge. A lender writes down one false-negative cost ratio before any test account is scored, and that ratio selects a threshold another person can inspect.</w:t>
       </w:r>
     </w:p>
     <w:p>
@@ -266,7 +266,7 @@
           <w:i w:val="0"/>
           <w:sz w:val="24"/>
         </w:rPr>
-        <w:t>The ratio is fixed before any test account is scored. The knowledge is an explicit false-negative cost ratio. It is not a post hoc explanation of a fitted model. Prediction-first selection fixes the model by validation F1 at threshold 0.50, then tunes only the threshold. Decision-first selection chooses the model and the threshold together by validation cost. On each split, the test set is scored once, after both rules are locked. The contribution is Eq. (1), the two selection rules in Eqs. (2) and (3), and the same lock repeated on 20 stratified splits. Section 4 separates the gap between the rules from the move away from threshold 0.50. The study does not claim that decision-first selection is uniformly superior.</w:t>
+        <w:t>Cost-sensitive objectives are used for default prediction, reject inference, credit-risk learning, company financial-distress prediction, and asymmetric-loss assessment [4–8]. Some of those costs vary by account [4,6]. Profit-driven scoring replaces a single ratio with a monetary loss [9,10]. The ratio r in this study is a scenario weight, not an estimated loss and not a per-account cost. Imbalance is often carried by the learner, by a changed boosting loss, or by resampling and augmentation [11–16]. None of those devices is used here. Four probability models are fit without class weights, and the threshold grid carries both the base rate and r.</w:t>
       </w:r>
     </w:p>
     <w:p>
@@ -281,7 +281,7 @@
           <w:i w:val="0"/>
           <w:sz w:val="24"/>
         </w:rPr>
-        <w:t>The comparison uses the public Default of Credit Card Clients file [5]. It records credit-card accounts, not entrepreneurial startups. The operational question is whether a lender, including a smaller lending venture, can state a cost ratio and publish the threshold that ratio implies.</w:t>
+        <w:t>Predictive comparisons are already a large literature: imbalanced and interpretable scoring [17,18], ensembles [19,20], credit-card customer models [21], stacking that brings in business knowledge [22], cross-institution imbalanced scoring [23], and XGBoost hyperparameter search [24]. This short communication does not add another accuracy contest. Prediction-first selection fixes the model by validation F1 at threshold 0.50, then tunes only the threshold. Decision-first selection chooses the model and the threshold together by validation cost. On each split, the test set is scored once, after both rules are locked. The contribution is Eq. (1), the two selection rules in Eqs. (2) and (3), and the same lock repeated on 20 stratified splits. Section 4 separates the gap between the rules from the move away from threshold 0.50. The study does not claim that decision-first selection is uniformly superior. The comparison uses the public Default of Credit Card Clients file [25,26].</w:t>
       </w:r>
     </w:p>
     <w:p>
@@ -1193,7 +1193,7 @@
           <w:i w:val="0"/>
           <w:sz w:val="24"/>
         </w:rPr>
-        <w:t>The source file is the UCI Default of Credit Card Clients workbook [5,6]. It has 30,000 accounts and 6,636 defaults (22.12%). The identifier column is dropped. The public file contains SEX. SEX is removed before the split because a credit decision policy should not use sex, and this study does not estimate a sex effect. The other 22 predictors are kept as the numeric codes in the file, including education, marriage, age, recent repayment status, bill amounts, and payment amounts.</w:t>
+        <w:t>The source file is the UCI Default of Credit Card Clients workbook [25,26]. It has 30,000 accounts and 6,636 defaults (22.12%). The same file is still used for predictive comparisons [27]. The identifier column is dropped. The public file contains SEX. Algorithmic bias in credit scoring support systems is an active design problem [28]. SEX is removed before the split because a credit decision policy should not use sex, and this study does not estimate a sex effect. The other 22 predictors are kept as the numeric codes in the file, including education, marriage, age, recent repayment status, bill amounts, and payment amounts.</w:t>
       </w:r>
     </w:p>
     <w:p>
@@ -5804,7 +5804,7 @@
           <w:i w:val="0"/>
           <w:sz w:val="24"/>
         </w:rPr>
-        <w:t xml:space="preserve">The practical object is a decision a person can audit. A credit operation writes down </w:t>
+        <w:t xml:space="preserve">A credit operation, including a smaller lending venture, writes down </w:t>
       </w:r>
       <w:r>
         <w:rPr>
@@ -5822,7 +5822,25 @@
           <w:i w:val="0"/>
           <w:sz w:val="24"/>
         </w:rPr>
-        <w:t>, the relative cost of missing a default, and publishes the threshold returned by Eq. (2) or Eq. (3). A smaller lending venture can do the same on its own book. The auditable object is the pair (</w:t>
+        <w:t xml:space="preserve"> and publishes the threshold from Eq. (2) or Eq. (3). On this file, </w:t>
+      </w:r>
+      <w:r>
+        <w:rPr>
+          <w:rFonts w:ascii="Times New Roman" w:hAnsi="Times New Roman" w:cs="Times New Roman" w:eastAsia="Times New Roman"/>
+          <w:b w:val="0"/>
+          <w:i/>
+          <w:sz w:val="24"/>
+        </w:rPr>
+        <w:t>r</w:t>
+      </w:r>
+      <w:r>
+        <w:rPr>
+          <w:rFonts w:ascii="Times New Roman" w:hAnsi="Times New Roman" w:cs="Times New Roman" w:eastAsia="Times New Roman"/>
+          <w:b w:val="0"/>
+          <w:i w:val="0"/>
+          <w:sz w:val="24"/>
+        </w:rPr>
+        <w:t xml:space="preserve"> = 10 moves the prediction-first rule from 0.50 to 0.09. Online consumer credit is already framed as a risk-management task [29]. Digital-transformation research treats the organizational resource, rather than the software alone, as what has to change [30]. Here that resource is the pair (</w:t>
       </w:r>
       <w:r>
         <w:rPr>
@@ -5858,7 +5876,7 @@
           <w:i w:val="0"/>
           <w:sz w:val="24"/>
         </w:rPr>
-        <w:t xml:space="preserve">). On this file, setting </w:t>
+        <w:t xml:space="preserve">). The UCI file contains Taiwanese credit-card clients [25]. It is not a startup portfolio, and </w:t>
       </w:r>
       <w:r>
         <w:rPr>
@@ -5876,25 +5894,7 @@
           <w:i w:val="0"/>
           <w:sz w:val="24"/>
         </w:rPr>
-        <w:t xml:space="preserve"> = 10 moves the prediction-first rule from 0.50 to 0.09. That is a change in the decision process of the sort digital-transformation research describes as organizational, not merely technical [1]. The UCI file contains Taiwanese credit-card clients [5]. It is not a startup portfolio. Product, portfolio, and loss given default will differ in another book, and </w:t>
-      </w:r>
-      <w:r>
-        <w:rPr>
-          <w:rFonts w:ascii="Times New Roman" w:hAnsi="Times New Roman" w:cs="Times New Roman" w:eastAsia="Times New Roman"/>
-          <w:b w:val="0"/>
-          <w:i/>
-          <w:sz w:val="24"/>
-        </w:rPr>
-        <w:t>r</w:t>
-      </w:r>
-      <w:r>
-        <w:rPr>
-          <w:rFonts w:ascii="Times New Roman" w:hAnsi="Times New Roman" w:cs="Times New Roman" w:eastAsia="Times New Roman"/>
-          <w:b w:val="0"/>
-          <w:i w:val="0"/>
-          <w:sz w:val="24"/>
-        </w:rPr>
-        <w:t xml:space="preserve"> here is a scenario weight rather than a measured loss.</w:t>
+        <w:t xml:space="preserve"> is a scenario weight rather than a measured loss.</w:t>
       </w:r>
     </w:p>
     <w:p>
@@ -5925,7 +5925,7 @@
           <w:i w:val="0"/>
           <w:sz w:val="24"/>
         </w:rPr>
-        <w:t xml:space="preserve">The useful output is a threshold tied to a stated cost ratio. On the seed-42 split, decision-first selection was conclusively cheaper only at </w:t>
+        <w:t xml:space="preserve">The useful output is a threshold tied to a stated cost ratio. Decision-first selection was conclusively cheaper only at </w:t>
       </w:r>
       <w:r>
         <w:rPr>
@@ -5997,7 +5997,7 @@
           <w:i w:val="0"/>
           <w:sz w:val="24"/>
         </w:rPr>
-        <w:t xml:space="preserve"> = 20, the strategy difference was not statistically conclusive, and at </w:t>
+        <w:t xml:space="preserve"> = 20, the strategy difference was not statistically conclusive. Across seeds 42 through 61, tuned test cost was lower than the cost at 0.50 on all 20 splits at the three higher ratios, and that range is not a confidence interval. The </w:t>
       </w:r>
       <w:r>
         <w:rPr>
@@ -6015,79 +6015,7 @@
           <w:i w:val="0"/>
           <w:sz w:val="24"/>
         </w:rPr>
-        <w:t xml:space="preserve"> = 5 the point estimate favored prediction-first selection. Tuning the prediction-first threshold away from 0.50 changed test cost only modestly at </w:t>
-      </w:r>
-      <w:r>
-        <w:rPr>
-          <w:rFonts w:ascii="Times New Roman" w:hAnsi="Times New Roman" w:cs="Times New Roman" w:eastAsia="Times New Roman"/>
-          <w:b w:val="0"/>
-          <w:i/>
-          <w:sz w:val="24"/>
-        </w:rPr>
-        <w:t>r</w:t>
-      </w:r>
-      <w:r>
-        <w:rPr>
-          <w:rFonts w:ascii="Times New Roman" w:hAnsi="Times New Roman" w:cs="Times New Roman" w:eastAsia="Times New Roman"/>
-          <w:b w:val="0"/>
-          <w:i w:val="0"/>
-          <w:sz w:val="24"/>
-        </w:rPr>
-        <w:t xml:space="preserve"> = 2, where the interval included zero, and by a conclusive margin at the three higher ratios. Across seeds 42 through 61, decision-first selection was not uniformly cheaper, and at ratios 5, 10, and 20 the tuned test cost was lower than the cost at 0.50 on all 20 splits. The bootstrap does not refit the models, and the range across splits is not a confidence interval. The </w:t>
-      </w:r>
-      <w:r>
-        <w:rPr>
-          <w:rFonts w:ascii="Times New Roman" w:hAnsi="Times New Roman" w:cs="Times New Roman" w:eastAsia="Times New Roman"/>
-          <w:b w:val="0"/>
-          <w:i/>
-          <w:sz w:val="24"/>
-        </w:rPr>
-        <w:t>r</w:t>
-      </w:r>
-      <w:r>
-        <w:rPr>
-          <w:rFonts w:ascii="Times New Roman" w:hAnsi="Times New Roman" w:cs="Times New Roman" w:eastAsia="Times New Roman"/>
-          <w:b w:val="0"/>
-          <w:i w:val="0"/>
-          <w:sz w:val="24"/>
-        </w:rPr>
-        <w:t xml:space="preserve"> = 20 prediction-first threshold sits on the lower edge of the grid. SEX was present in the source file, was excluded from the predictors, and was not used to estimate a sex effect. Within those limits, a lender that can state </w:t>
-      </w:r>
-      <w:r>
-        <w:rPr>
-          <w:rFonts w:ascii="Times New Roman" w:hAnsi="Times New Roman" w:cs="Times New Roman" w:eastAsia="Times New Roman"/>
-          <w:b w:val="0"/>
-          <w:i/>
-          <w:sz w:val="24"/>
-        </w:rPr>
-        <w:t>r</w:t>
-      </w:r>
-      <w:r>
-        <w:rPr>
-          <w:rFonts w:ascii="Times New Roman" w:hAnsi="Times New Roman" w:cs="Times New Roman" w:eastAsia="Times New Roman"/>
-          <w:b w:val="0"/>
-          <w:i w:val="0"/>
-          <w:sz w:val="24"/>
-        </w:rPr>
-        <w:t xml:space="preserve"> can publish the threshold that </w:t>
-      </w:r>
-      <w:r>
-        <w:rPr>
-          <w:rFonts w:ascii="Times New Roman" w:hAnsi="Times New Roman" w:cs="Times New Roman" w:eastAsia="Times New Roman"/>
-          <w:b w:val="0"/>
-          <w:i/>
-          <w:sz w:val="24"/>
-        </w:rPr>
-        <w:t>r</w:t>
-      </w:r>
-      <w:r>
-        <w:rPr>
-          <w:rFonts w:ascii="Times New Roman" w:hAnsi="Times New Roman" w:cs="Times New Roman" w:eastAsia="Times New Roman"/>
-          <w:b w:val="0"/>
-          <w:i w:val="0"/>
-          <w:sz w:val="24"/>
-        </w:rPr>
-        <w:t xml:space="preserve"> implies.</w:t>
+        <w:t xml:space="preserve"> = 20 prediction-first threshold sits on the lower edge of the grid. SEX was excluded from the predictors and was not used to estimate a sex effect.</w:t>
       </w:r>
     </w:p>
     <w:p>
@@ -6118,7 +6046,7 @@
           <w:i w:val="0"/>
           <w:sz w:val="24"/>
         </w:rPr>
-        <w:t>The Default of Credit Card Clients file is the UCI Machine Learning Repository dataset introduced by Yeh and Lien [5,6] (https://doi.org/10.24432/C55S3H). The script that regenerates the tables and figures is run.py in https://github.com/pravallika-nalluri-dba/kbs-cost-aware-classification.</w:t>
+        <w:t>The Default of Credit Card Clients file is the UCI Machine Learning Repository dataset introduced by Yeh and Lien [25,26] (https://doi.org/10.24432/C55S3H). The script that regenerates the tables and figures is run.py in https://github.com/pravallika-nalluri-dba/kbs-cost-aware-classification.</w:t>
       </w:r>
     </w:p>
     <w:p>
@@ -6282,7 +6210,7 @@
           <w:i w:val="0"/>
           <w:sz w:val="24"/>
         </w:rPr>
-        <w:t>[1] Gregory Vial, 2019. Understanding digital transformation: A review and a research agenda. The Journal of Strategic Information Systems 28 (2), 118–144. https://doi.org/10.1016/j.jsis.2019.01.003</w:t>
+        <w:t>[1] Khaoula Idbenjra, Kristof Coussement, Arno De Caigny, 2024. Investigating the beneficial impact of segmentation-based modelling for credit scoring. Decision Support Systems 179, 114170. https://doi.org/10.1016/j.dss.2024.114170</w:t>
       </w:r>
     </w:p>
     <w:p>
@@ -6297,7 +6225,7 @@
           <w:i w:val="0"/>
           <w:sz w:val="24"/>
         </w:rPr>
-        <w:t>[2] Stefan Lessmann, Bart Baesens, Hsin-Vonn Seow, Lyn C. Thomas, 2015. Benchmarking state-of-the-art classification algorithms for credit scoring: An update of research. European Journal of Operational Research 247 (1), 124–136. https://doi.org/10.1016/j.ejor.2015.05.030</w:t>
+        <w:t>[2] Yusheng Li, Feng Gao, Mengyi Sha, Xueyan Shao, 2024. Sequential three-way decision with automatic threshold learning for credit risk prediction. Applied Soft Computing 165, 112127. https://doi.org/10.1016/j.asoc.2024.112127</w:t>
       </w:r>
     </w:p>
     <w:p>
@@ -6312,7 +6240,7 @@
           <w:i w:val="0"/>
           <w:sz w:val="24"/>
         </w:rPr>
-        <w:t>[3] Charles Elkan, 2001. The foundations of cost-sensitive learning. In: Proceedings of the 17th International Joint Conference on Artificial Intelligence (IJCAI 2001), vol. 2, pp. 973–978. Morgan Kaufmann.</w:t>
+        <w:t>[3] Marija Kopanja, Miloš Savić, Luca Longo, 2025. CORTEX: Cost-sensitive rule and tree extraction method. Knowledge-Based Systems 330, 114592. https://doi.org/10.1016/j.knosys.2025.114592</w:t>
       </w:r>
     </w:p>
     <w:p>
@@ -6327,7 +6255,7 @@
           <w:i w:val="0"/>
           <w:sz w:val="24"/>
         </w:rPr>
-        <w:t>[4] Foster Provost, Tom Fawcett, 2001. Robust classification for imprecise environments. Machine Learning 42 (3), 203–231. https://doi.org/10.1023/A:1007601015854</w:t>
+        <w:t>[4] Jin Xing, Guotai Chi, Ancheng Pan, 2024. Instance-dependent misclassification cost-sensitive learning for default prediction. Research in International Business and Finance 69, 102265. https://doi.org/10.1016/j.ribaf.2024.102265</w:t>
       </w:r>
     </w:p>
     <w:p>
@@ -6342,7 +6270,7 @@
           <w:i w:val="0"/>
           <w:sz w:val="24"/>
         </w:rPr>
-        <w:t>[5] I-Cheng Yeh, Che-hui Lien, 2009. The comparisons of data mining techniques for the predictive accuracy of probability of default of credit card clients. Expert Systems with Applications 36 (2), 2473–2480. https://doi.org/10.1016/j.eswa.2007.12.020</w:t>
+        <w:t>[5] Feng Shen, Zhiyuan Yang, Jia Kuang, Zhangyao Zhu, 2024. Reject inference in credit scoring based on cost-sensitive learning and joint distribution adaptation method. Expert Systems with Applications 251, 124072. https://doi.org/10.1016/j.eswa.2024.124072</w:t>
       </w:r>
     </w:p>
     <w:p>
@@ -6357,7 +6285,367 @@
           <w:i w:val="0"/>
           <w:sz w:val="24"/>
         </w:rPr>
-        <w:t>[6] I-Cheng Yeh, 2009. Default of Credit Card Clients [dataset]. UCI Machine Learning Repository. https://doi.org/10.24432/C55S3H</w:t>
+        <w:t>[6] Jorge C-Rella, David Martinez Rego, Juan M. Vilar, 2025. Cost-sensitive reinforcement learning for credit risk. Expert Systems with Applications 272, 126708. https://doi.org/10.1016/j.eswa.2025.126708</w:t>
+      </w:r>
+    </w:p>
+    <w:p>
+      <w:pPr>
+        <w:spacing w:line="480" w:lineRule="auto" w:before="0" w:after="0"/>
+        <w:jc w:val="left"/>
+      </w:pPr>
+      <w:r>
+        <w:rPr>
+          <w:rFonts w:ascii="Times New Roman" w:hAnsi="Times New Roman" w:cs="Times New Roman" w:eastAsia="Times New Roman"/>
+          <w:b w:val="0"/>
+          <w:i w:val="0"/>
+          <w:sz w:val="24"/>
+        </w:rPr>
+        <w:t>[7] Shanshan Wang, Guotai Chi, 2024. Cost-sensitive stacking ensemble learning for company financial distress prediction. Expert Systems with Applications 255, 124525. https://doi.org/10.1016/j.eswa.2024.124525</w:t>
+      </w:r>
+    </w:p>
+    <w:p>
+      <w:pPr>
+        <w:spacing w:line="480" w:lineRule="auto" w:before="0" w:after="0"/>
+        <w:jc w:val="left"/>
+      </w:pPr>
+      <w:r>
+        <w:rPr>
+          <w:rFonts w:ascii="Times New Roman" w:hAnsi="Times New Roman" w:cs="Times New Roman" w:eastAsia="Times New Roman"/>
+          <w:b w:val="0"/>
+          <w:i w:val="0"/>
+          <w:sz w:val="24"/>
+        </w:rPr>
+        <w:t>[8] Xiaoxi Zhao, Yingjie Tian, 2024. Credit risk assessment method driven by asymmetric loss function. Applied Soft Computing 167, 112355. https://doi.org/10.1016/j.asoc.2024.112355</w:t>
+      </w:r>
+    </w:p>
+    <w:p>
+      <w:pPr>
+        <w:spacing w:line="480" w:lineRule="auto" w:before="0" w:after="0"/>
+        <w:jc w:val="left"/>
+      </w:pPr>
+      <w:r>
+        <w:rPr>
+          <w:rFonts w:ascii="Times New Roman" w:hAnsi="Times New Roman" w:cs="Times New Roman" w:eastAsia="Times New Roman"/>
+          <w:b w:val="0"/>
+          <w:i w:val="0"/>
+          <w:sz w:val="24"/>
+        </w:rPr>
+        <w:t>[9] Yong Xu, Gang Kou, Daji Ergu, 2025. Profit-based uncertainty estimation with application to credit scoring. European Journal of Operational Research 325 (2), 303–316. https://doi.org/10.1016/j.ejor.2025.03.007</w:t>
+      </w:r>
+    </w:p>
+    <w:p>
+      <w:pPr>
+        <w:spacing w:line="480" w:lineRule="auto" w:before="0" w:after="0"/>
+        <w:jc w:val="left"/>
+      </w:pPr>
+      <w:r>
+        <w:rPr>
+          <w:rFonts w:ascii="Times New Roman" w:hAnsi="Times New Roman" w:cs="Times New Roman" w:eastAsia="Times New Roman"/>
+          <w:b w:val="0"/>
+          <w:i w:val="0"/>
+          <w:sz w:val="24"/>
+        </w:rPr>
+        <w:t>[10] Yong Xu, Daji Ergu, 2026. Understanding the profit-driven credit scoring: New insights on loss functions and measures. Applied Soft Computing 186, 114184. https://doi.org/10.1016/j.asoc.2025.114184</w:t>
+      </w:r>
+    </w:p>
+    <w:p>
+      <w:pPr>
+        <w:spacing w:line="480" w:lineRule="auto" w:before="0" w:after="0"/>
+        <w:jc w:val="left"/>
+      </w:pPr>
+      <w:r>
+        <w:rPr>
+          <w:rFonts w:ascii="Times New Roman" w:hAnsi="Times New Roman" w:cs="Times New Roman" w:eastAsia="Times New Roman"/>
+          <w:b w:val="0"/>
+          <w:i w:val="0"/>
+          <w:sz w:val="24"/>
+        </w:rPr>
+        <w:t>[11] Jingjing Tang, Yan Li, Zhaojie Hou, Saiji Fu, Yingjie Tian, 2024. Robust two-stage instance-level cost-sensitive learning method for class imbalance problem. Knowledge-Based Systems 300, 112143. https://doi.org/10.1016/j.knosys.2024.112143</w:t>
+      </w:r>
+    </w:p>
+    <w:p>
+      <w:pPr>
+        <w:spacing w:line="480" w:lineRule="auto" w:before="0" w:after="0"/>
+        <w:jc w:val="left"/>
+      </w:pPr>
+      <w:r>
+        <w:rPr>
+          <w:rFonts w:ascii="Times New Roman" w:hAnsi="Times New Roman" w:cs="Times New Roman" w:eastAsia="Times New Roman"/>
+          <w:b w:val="0"/>
+          <w:i w:val="0"/>
+          <w:sz w:val="24"/>
+        </w:rPr>
+        <w:t>[12] Jonah Mushava, Michael Murray, 2024. Flexible loss functions for binary classification in gradient-boosted decision trees: An application to credit scoring. Expert Systems with Applications 238, 121876. https://doi.org/10.1016/j.eswa.2023.121876</w:t>
+      </w:r>
+    </w:p>
+    <w:p>
+      <w:pPr>
+        <w:spacing w:line="480" w:lineRule="auto" w:before="0" w:after="0"/>
+        <w:jc w:val="left"/>
+      </w:pPr>
+      <w:r>
+        <w:rPr>
+          <w:rFonts w:ascii="Times New Roman" w:hAnsi="Times New Roman" w:cs="Times New Roman" w:eastAsia="Times New Roman"/>
+          <w:b w:val="0"/>
+          <w:i w:val="0"/>
+          <w:sz w:val="24"/>
+        </w:rPr>
+        <w:t>[13] Futian Weng, Miao Zhu, Mike Buckle, Petr Hajek, Mohammad Zoynul Abedin, 2025. Class imbalance Bayesian model averaging for consumer loan default prediction: The role of soft credit information. Research in International Business and Finance 74, 102722. https://doi.org/10.1016/j.ribaf.2024.102722</w:t>
+      </w:r>
+    </w:p>
+    <w:p>
+      <w:pPr>
+        <w:spacing w:line="480" w:lineRule="auto" w:before="0" w:after="0"/>
+        <w:jc w:val="left"/>
+      </w:pPr>
+      <w:r>
+        <w:rPr>
+          <w:rFonts w:ascii="Times New Roman" w:hAnsi="Times New Roman" w:cs="Times New Roman" w:eastAsia="Times New Roman"/>
+          <w:b w:val="0"/>
+          <w:i w:val="0"/>
+          <w:sz w:val="24"/>
+        </w:rPr>
+        <w:t>[14] Azree Nazri, Olalekan Agbolade, Faisal Aziz, 2025. Hybrid reinforcement learning-active learning framework for real-data augmentation in imbalanced credit scoring. IEEE Access 13, 191005–191023. https://doi.org/10.1109/ACCESS.2025.3608032</w:t>
+      </w:r>
+    </w:p>
+    <w:p>
+      <w:pPr>
+        <w:spacing w:line="480" w:lineRule="auto" w:before="0" w:after="0"/>
+        <w:jc w:val="left"/>
+      </w:pPr>
+      <w:r>
+        <w:rPr>
+          <w:rFonts w:ascii="Times New Roman" w:hAnsi="Times New Roman" w:cs="Times New Roman" w:eastAsia="Times New Roman"/>
+          <w:b w:val="0"/>
+          <w:i w:val="0"/>
+          <w:sz w:val="24"/>
+        </w:rPr>
+        <w:t>[15] Yutong Sun, Yanting Ji, Xiangxing Tao, 2024. Research on default classification of unbalanced credit data based on PixelCNN-WGAN. Electronics 13 (17), 3419. https://doi.org/10.3390/electronics13173419</w:t>
+      </w:r>
+    </w:p>
+    <w:p>
+      <w:pPr>
+        <w:spacing w:line="480" w:lineRule="auto" w:before="0" w:after="0"/>
+        <w:jc w:val="left"/>
+      </w:pPr>
+      <w:r>
+        <w:rPr>
+          <w:rFonts w:ascii="Times New Roman" w:hAnsi="Times New Roman" w:cs="Times New Roman" w:eastAsia="Times New Roman"/>
+          <w:b w:val="0"/>
+          <w:i w:val="0"/>
+          <w:sz w:val="24"/>
+        </w:rPr>
+        <w:t>[16] Sudhansu Ranjan Lenka, Sukant Kishoro Bisoy, Rojalina Priyadarshini, Kueh Lee Hui, Mangal Sain, 2024. Evolutionary-based multi-objective and conditional generative adversarial networks for credit scoring. IEEE Access 12, 158346–158366. https://doi.org/10.1109/ACCESS.2024.3486909</w:t>
+      </w:r>
+    </w:p>
+    <w:p>
+      <w:pPr>
+        <w:spacing w:line="480" w:lineRule="auto" w:before="0" w:after="0"/>
+        <w:jc w:val="left"/>
+      </w:pPr>
+      <w:r>
+        <w:rPr>
+          <w:rFonts w:ascii="Times New Roman" w:hAnsi="Times New Roman" w:cs="Times New Roman" w:eastAsia="Times New Roman"/>
+          <w:b w:val="0"/>
+          <w:i w:val="0"/>
+          <w:sz w:val="24"/>
+        </w:rPr>
+        <w:t>[17] Yujia Chen, Raffaella Calabrese, Belen Martin-Barragan, 2024. Interpretable machine learning for imbalanced credit scoring datasets. European Journal of Operational Research 312 (1), 357–372. https://doi.org/10.1016/j.ejor.2023.06.036</w:t>
+      </w:r>
+    </w:p>
+    <w:p>
+      <w:pPr>
+        <w:spacing w:line="480" w:lineRule="auto" w:before="0" w:after="0"/>
+        <w:jc w:val="left"/>
+      </w:pPr>
+      <w:r>
+        <w:rPr>
+          <w:rFonts w:ascii="Times New Roman" w:hAnsi="Times New Roman" w:cs="Times New Roman" w:eastAsia="Times New Roman"/>
+          <w:b w:val="0"/>
+          <w:i w:val="0"/>
+          <w:sz w:val="24"/>
+        </w:rPr>
+        <w:t>[18] Jiancheng Tu, Zhibin Wu, 2025. Inherently interpretable machine learning for credit scoring: Optimal classification tree with hyperplane splits. European Journal of Operational Research 322 (2), 647–664. https://doi.org/10.1016/j.ejor.2024.10.046</w:t>
+      </w:r>
+    </w:p>
+    <w:p>
+      <w:pPr>
+        <w:spacing w:line="480" w:lineRule="auto" w:before="0" w:after="0"/>
+        <w:jc w:val="left"/>
+      </w:pPr>
+      <w:r>
+        <w:rPr>
+          <w:rFonts w:ascii="Times New Roman" w:hAnsi="Times New Roman" w:cs="Times New Roman" w:eastAsia="Times New Roman"/>
+          <w:b w:val="0"/>
+          <w:i w:val="0"/>
+          <w:sz w:val="24"/>
+        </w:rPr>
+        <w:t>[19] Soonjae Kwon, Jaeyeon Jang, Chang Ouk Kim, 2025. Credit scoring using multi-task Siamese neural network for improving prediction performance and stability. Expert Systems with Applications 259, 125327. https://doi.org/10.1016/j.eswa.2024.125327</w:t>
+      </w:r>
+    </w:p>
+    <w:p>
+      <w:pPr>
+        <w:spacing w:line="480" w:lineRule="auto" w:before="0" w:after="0"/>
+        <w:jc w:val="left"/>
+      </w:pPr>
+      <w:r>
+        <w:rPr>
+          <w:rFonts w:ascii="Times New Roman" w:hAnsi="Times New Roman" w:cs="Times New Roman" w:eastAsia="Times New Roman"/>
+          <w:b w:val="0"/>
+          <w:i w:val="0"/>
+          <w:sz w:val="24"/>
+        </w:rPr>
+        <w:t>[20] Dongqi Yang, Binqing Xiao, Mengya Cao, Huaqi Shen, 2024. A new hybrid credit scoring ensemble model with feature enhancement and soft voting weight optimization. Expert Systems with Applications 238, 122101. https://doi.org/10.1016/j.eswa.2023.122101</w:t>
+      </w:r>
+    </w:p>
+    <w:p>
+      <w:pPr>
+        <w:spacing w:line="480" w:lineRule="auto" w:before="0" w:after="0"/>
+        <w:jc w:val="left"/>
+      </w:pPr>
+      <w:r>
+        <w:rPr>
+          <w:rFonts w:ascii="Times New Roman" w:hAnsi="Times New Roman" w:cs="Times New Roman" w:eastAsia="Times New Roman"/>
+          <w:b w:val="0"/>
+          <w:i w:val="0"/>
+          <w:sz w:val="24"/>
+        </w:rPr>
+        <w:t>[21] Victor Chang, Sharuga Sivakulasingam, Hai Wang, Siu Tung Wong, Meghana Ashok Ganatra, Jiabin Luo, 2024. Credit risk prediction using machine learning and deep learning: A study on credit card customers. Risks 12 (11), 174. https://doi.org/10.3390/risks12110174</w:t>
+      </w:r>
+    </w:p>
+    <w:p>
+      <w:pPr>
+        <w:spacing w:line="480" w:lineRule="auto" w:before="0" w:after="0"/>
+        <w:jc w:val="left"/>
+      </w:pPr>
+      <w:r>
+        <w:rPr>
+          <w:rFonts w:ascii="Times New Roman" w:hAnsi="Times New Roman" w:cs="Times New Roman" w:eastAsia="Times New Roman"/>
+          <w:b w:val="0"/>
+          <w:i w:val="0"/>
+          <w:sz w:val="24"/>
+        </w:rPr>
+        <w:t>[22] Ming-Liang Ding, Yu-Liang Ma, Fu-Qiang You, 2025. Domain-constrained stacking framework for credit default prediction. Mathematics 13 (21), 3451. https://doi.org/10.3390/math13213451</w:t>
+      </w:r>
+    </w:p>
+    <w:p>
+      <w:pPr>
+        <w:spacing w:line="480" w:lineRule="auto" w:before="0" w:after="0"/>
+        <w:jc w:val="left"/>
+      </w:pPr>
+      <w:r>
+        <w:rPr>
+          <w:rFonts w:ascii="Times New Roman" w:hAnsi="Times New Roman" w:cs="Times New Roman" w:eastAsia="Times New Roman"/>
+          <w:b w:val="0"/>
+          <w:i w:val="0"/>
+          <w:sz w:val="24"/>
+        </w:rPr>
+        <w:t>[23] Zhongyi Wang, Yuhang Tian, Sihan Li, Jin Xiao, 2025. A secure cross-silo collaborative method for imbalanced credit scoring. European Journal of Operational Research 326 (2), 357–373. https://doi.org/10.1016/j.ejor.2025.04.020</w:t>
+      </w:r>
+    </w:p>
+    <w:p>
+      <w:pPr>
+        <w:spacing w:line="480" w:lineRule="auto" w:before="0" w:after="0"/>
+        <w:jc w:val="left"/>
+      </w:pPr>
+      <w:r>
+        <w:rPr>
+          <w:rFonts w:ascii="Times New Roman" w:hAnsi="Times New Roman" w:cs="Times New Roman" w:eastAsia="Times New Roman"/>
+          <w:b w:val="0"/>
+          <w:i w:val="0"/>
+          <w:sz w:val="24"/>
+        </w:rPr>
+        <w:t>[24] Atul Vikas Lakra, Sudarson Jena, Kaushik Mishra, 2025. Optimizing XGBoost hyperparameters for credit scoring classification using weighted cognitive avoidance particle swarm. IEEE Access 13, 127292–127306. https://doi.org/10.1109/ACCESS.2025.3585980</w:t>
+      </w:r>
+    </w:p>
+    <w:p>
+      <w:pPr>
+        <w:spacing w:line="480" w:lineRule="auto" w:before="0" w:after="0"/>
+        <w:jc w:val="left"/>
+      </w:pPr>
+      <w:r>
+        <w:rPr>
+          <w:rFonts w:ascii="Times New Roman" w:hAnsi="Times New Roman" w:cs="Times New Roman" w:eastAsia="Times New Roman"/>
+          <w:b w:val="0"/>
+          <w:i w:val="0"/>
+          <w:sz w:val="24"/>
+        </w:rPr>
+        <w:t>[25] I-Cheng Yeh, Che-hui Lien, 2009. The comparisons of data mining techniques for the predictive accuracy of probability of default of credit card clients. Expert Systems with Applications 36 (2), 2473–2480. https://doi.org/10.1016/j.eswa.2007.12.020</w:t>
+      </w:r>
+    </w:p>
+    <w:p>
+      <w:pPr>
+        <w:spacing w:line="480" w:lineRule="auto" w:before="0" w:after="0"/>
+        <w:jc w:val="left"/>
+      </w:pPr>
+      <w:r>
+        <w:rPr>
+          <w:rFonts w:ascii="Times New Roman" w:hAnsi="Times New Roman" w:cs="Times New Roman" w:eastAsia="Times New Roman"/>
+          <w:b w:val="0"/>
+          <w:i w:val="0"/>
+          <w:sz w:val="24"/>
+        </w:rPr>
+        <w:t>[26] I-Cheng Yeh, 2009. Default of Credit Card Clients [dataset]. UCI Machine Learning Repository. https://doi.org/10.24432/C55S3H</w:t>
+      </w:r>
+    </w:p>
+    <w:p>
+      <w:pPr>
+        <w:spacing w:line="480" w:lineRule="auto" w:before="0" w:after="0"/>
+        <w:jc w:val="left"/>
+      </w:pPr>
+      <w:r>
+        <w:rPr>
+          <w:rFonts w:ascii="Times New Roman" w:hAnsi="Times New Roman" w:cs="Times New Roman" w:eastAsia="Times New Roman"/>
+          <w:b w:val="0"/>
+          <w:i w:val="0"/>
+          <w:sz w:val="24"/>
+        </w:rPr>
+        <w:t>[27] Rakshith Bhandary, Bidyut Kumar Ghosh, 2025. Credit card default prediction: An empirical analysis on predictive performance using statistical and machine learning methods. Journal of Risk and Financial Management 18 (1), 23. https://doi.org/10.3390/jrfm18010023</w:t>
+      </w:r>
+    </w:p>
+    <w:p>
+      <w:pPr>
+        <w:spacing w:line="480" w:lineRule="auto" w:before="0" w:after="0"/>
+        <w:jc w:val="left"/>
+      </w:pPr>
+      <w:r>
+        <w:rPr>
+          <w:rFonts w:ascii="Times New Roman" w:hAnsi="Times New Roman" w:cs="Times New Roman" w:eastAsia="Times New Roman"/>
+          <w:b w:val="0"/>
+          <w:i w:val="0"/>
+          <w:sz w:val="24"/>
+        </w:rPr>
+        <w:t>[28] Junye Lin, Liping Yang, 2026. Mitigating algorithmic bias in credit scoring support systems through adversarial learning. Decision Support Systems 205, 114653. https://doi.org/10.1016/j.dss.2026.114653</w:t>
+      </w:r>
+    </w:p>
+    <w:p>
+      <w:pPr>
+        <w:spacing w:line="480" w:lineRule="auto" w:before="0" w:after="0"/>
+        <w:jc w:val="left"/>
+      </w:pPr>
+      <w:r>
+        <w:rPr>
+          <w:rFonts w:ascii="Times New Roman" w:hAnsi="Times New Roman" w:cs="Times New Roman" w:eastAsia="Times New Roman"/>
+          <w:b w:val="0"/>
+          <w:i w:val="0"/>
+          <w:sz w:val="24"/>
+        </w:rPr>
+        <w:t>[29] Miao Zhu, Ben-Chang Shia, Meng Su, Jialin Liu, 2024. Consumer default risk portrait: An intelligent management framework of online consumer credit default risk. Mathematics 12 (10), 1582. https://doi.org/10.3390/math12101582</w:t>
+      </w:r>
+    </w:p>
+    <w:p>
+      <w:pPr>
+        <w:spacing w:line="480" w:lineRule="auto" w:before="0" w:after="0"/>
+        <w:jc w:val="left"/>
+      </w:pPr>
+      <w:r>
+        <w:rPr>
+          <w:rFonts w:ascii="Times New Roman" w:hAnsi="Times New Roman" w:cs="Times New Roman" w:eastAsia="Times New Roman"/>
+          <w:b w:val="0"/>
+          <w:i w:val="0"/>
+          <w:sz w:val="24"/>
+        </w:rPr>
+        <w:t>[30] Gabriele Piccoli, Varun Grover, Joaquin Rodriguez, 2024. Digital transformation requires digital resource primacy: Clarification and future research directions. The Journal of Strategic Information Systems 33 (2), 101835. https://doi.org/10.1016/j.jsis.2024.101835</w:t>
       </w:r>
     </w:p>
     <w:sectPr>

</xml_diff>

<commit_message>
Center the short communication on threshold adaptation.
The cost saving comes mainly from moving the operating threshold, not from switching the selection rule. State that gap, treat the cost ratio and threshold as the knowledge, check the ratio-20 grid boundary, add validation Brier scores, and compare the 20 splits with a paired mean interval.

Co-authored-by: pravallikanalluri9848 <pravallikanalluri9848@gmail.com>
</commit_message>
<xml_diff>
--- a/Nalluri_KBS_SourceFile.docx
+++ b/Nalluri_KBS_SourceFile.docx
@@ -14,7 +14,7 @@
           <w:i w:val="0"/>
           <w:sz w:val="28"/>
         </w:rPr>
-        <w:t>A Knowledge-Based AI Framework for Data-Driven Cost-Aware Classification: Decision Support for Digital Transformation in Entrepreneurial Credit Innovation</w:t>
+        <w:t>Knowledge-Based Cost-Aware Decision Support for Credit Classification: Separating Model Selection from Decision Thresholds</w:t>
       </w:r>
     </w:p>
     <w:p>
@@ -105,7 +105,7 @@
           <w:i w:val="0"/>
           <w:sz w:val="24"/>
         </w:rPr>
-        <w:t>Credit decisions need an explicit cost for a missed default, not only a probability. This study states a normalized decision cost and compares two knowledge-based rules that turn probabilities into a yes-or-no action. Both rules are locked on a validation split before the test evaluation. On the UCI credit-card default file (30,000 accounts; 6,636 defaults, 22.12%), four probability models were fit without class weights. On the primary split (seed 42), prediction-first selection kept histogram gradient boosting, the model with the highest validation F1 at threshold 0.50 (0.4682), and then chose a cost-minimizing threshold. Decision-first selection searched every model and threshold for the lowest validation cost. Decision-first selection had the lower test cost at a false-negative cost ratio of 2 (relative difference 0.0406; paired bootstrap 95% interval for the cost difference, 0.0050 to 0.0210). At ratios 5, 10, and 20 that interval included zero, so the strategy difference is not statistically conclusive. Leaving threshold 0.50 reduced test cost at ratios 5, 10, and 20, and those intervals excluded zero; at ratio 2 the threshold contrast was not statistically conclusive. On 20 stratified splits (seeds 42 through 61), tuned test cost was lower than the cost at 0.50 on 19 of 20 splits at ratio 2 and on all 20 splits at ratios 5, 10, and 20. Ranges across splits are not confidence intervals. The public file is not a startup portfolio.</w:t>
+        <w:t>A predicted probability is not a credit decision. After the models are fit, this study separates which model to keep from which threshold turns its probability into an action. The knowledge is one false-negative cost ratio, fixed before any test account is scored. On the UCI credit-card default file (30,000 accounts; 6,636 defaults, 22.12%), four models were fit without class weights. Prediction-first selection kept histogram gradient boosting, the highest validation F1 at threshold 0.50 (0.4682), then tuned only its threshold. Decision-first selection searched every model and threshold for the lowest validation cost. Leaving 0.50 cut test cost from 0.7522 to 0.5762 at ratio 5, from 1.4605 to 0.7392 at ratio 10, and from 2.8772 to 0.7815 at ratio 20; those intervals excluded zero. At ratio 2 the threshold contrast was not statistically conclusive. Decision-first selection was cheaper at ratio 2 (relative difference 0.0406; interval 0.0050 to 0.0210). At ratios 5, 10, and 20 the strategy interval included zero. Across 20 splits (seeds 42 through 61) the mean gain from leaving 0.50 excluded zero at every ratio and exceeded the mean gap between the rules. The public file is not a startup portfolio.</w:t>
       </w:r>
     </w:p>
     <w:p>
@@ -129,7 +129,7 @@
           <w:i w:val="0"/>
           <w:sz w:val="24"/>
         </w:rPr>
-        <w:t>Cost-sensitive classification; Decision support; Decision threshold; Knowledge-based system; Credit scoring; Digital transformation</w:t>
+        <w:t>Cost-sensitive classification; Decision support; Decision threshold; Knowledge-based system; Credit scoring; Model selection</w:t>
       </w:r>
     </w:p>
     <w:p>
@@ -160,7 +160,7 @@
           <w:i w:val="0"/>
           <w:sz w:val="24"/>
         </w:rPr>
-        <w:t>• Explicit cost ratios turn default probabilities into thresholds.</w:t>
+        <w:t>• Most of the cost saving comes from the threshold, not the model.</w:t>
       </w:r>
     </w:p>
     <w:p>
@@ -175,7 +175,7 @@
           <w:i w:val="0"/>
           <w:sz w:val="24"/>
         </w:rPr>
-        <w:t>• Prediction-first fixes the F1 model, then tunes its threshold.</w:t>
+        <w:t>• The cost ratio is explicit knowledge: the inspectable pair (r, t).</w:t>
       </w:r>
     </w:p>
     <w:p>
@@ -190,7 +190,7 @@
           <w:i w:val="0"/>
           <w:sz w:val="24"/>
         </w:rPr>
-        <w:t>• Decision-first has a conclusively lower test cost only at ratio 2.</w:t>
+        <w:t>• Leaving 0.50 cuts cost at ratios 5, 10, and 20 on every split.</w:t>
       </w:r>
     </w:p>
     <w:p>
@@ -205,7 +205,7 @@
           <w:i w:val="0"/>
           <w:sz w:val="24"/>
         </w:rPr>
-        <w:t>• Strategy gaps at ratios 5, 10, and 20 are not statistically conclusive.</w:t>
+        <w:t>• Seed-42 strategy gap excludes zero only at cost ratio 2.</w:t>
       </w:r>
     </w:p>
     <w:p>
@@ -220,7 +220,7 @@
           <w:i w:val="0"/>
           <w:sz w:val="24"/>
         </w:rPr>
-        <w:t>• On all 20 splits, tuning beat threshold 0.50 at ratios 5, 10, and 20.</w:t>
+        <w:t>• At ratio 20, 0.009 does not lower the seed-42 test cost.</w:t>
       </w:r>
     </w:p>
     <w:p>
@@ -251,7 +251,7 @@
           <w:i w:val="0"/>
           <w:sz w:val="24"/>
         </w:rPr>
-        <w:t>Knowledge-based systems support a human decision, not only a ranked score. In credit, a probability of default is not itself an action. Decision-support credit scoring and automatic threshold learning already treat that action as the object to be chosen [1,2], and misclassification costs can be turned into explicit rules and trees [3]. This short communication keeps a simpler piece of knowledge. A lender writes down one false-negative cost ratio before any test account is scored, and that ratio selects a threshold another person can inspect.</w:t>
+        <w:t>A probability of default is not a credit decision. Accuracy comparisons, cost-sensitive training, class-imbalance corrections, and profit-driven scoring are already a large literature [1–24]. Less attention has been given to two choices made after the fit: which model to keep, and which threshold turns its probability into an action under a stated cost ratio. This short communication does not add another accuracy contest. It asks whether the cost saving comes from choosing a different model, or from changing the threshold of a model already chosen.</w:t>
       </w:r>
     </w:p>
     <w:p>
@@ -266,14 +266,17 @@
           <w:i w:val="0"/>
           <w:sz w:val="24"/>
         </w:rPr>
-        <w:t>Cost-sensitive objectives are used for default prediction, reject inference, credit-risk learning, company financial-distress prediction, and asymmetric-loss assessment [4–8]. Some of those costs vary by account [4,6]. Profit-driven scoring replaces a single ratio with a monetary loss [9,10]. The ratio r in this study is a scenario weight, not an estimated loss and not a per-account cost. Imbalance is often carried by the learner, by a changed boosting loss, or by resampling and augmentation [11–16]. None of those devices is used here. Four probability models are fit without class weights, and the threshold grid carries both the base rate and r.</w:t>
+        <w:t>Prediction-first selection fixes the model by validation F1 at threshold 0.50, then tunes only the threshold. Decision-first selection chooses the model and the threshold together by validation cost, and the test set is scored only after both rules are locked. In this study the knowledge component is deliberately compact: an externally specified asymmetric cost preference is an explicit decision rule rather than learned inside the classifier, and the inspectable object is the pair (</w:t>
       </w:r>
-    </w:p>
-    <w:p>
-      <w:pPr>
-        <w:spacing w:line="480" w:lineRule="auto" w:before="0" w:after="0"/>
-        <w:jc w:val="left"/>
-      </w:pPr>
+      <w:r>
+        <w:rPr>
+          <w:rFonts w:ascii="Times New Roman" w:hAnsi="Times New Roman" w:cs="Times New Roman" w:eastAsia="Times New Roman"/>
+          <w:b w:val="0"/>
+          <w:i/>
+          <w:sz w:val="24"/>
+        </w:rPr>
+        <w:t>r</w:t>
+      </w:r>
       <w:r>
         <w:rPr>
           <w:rFonts w:ascii="Times New Roman" w:hAnsi="Times New Roman" w:cs="Times New Roman" w:eastAsia="Times New Roman"/>
@@ -281,7 +284,25 @@
           <w:i w:val="0"/>
           <w:sz w:val="24"/>
         </w:rPr>
-        <w:t>Predictive comparisons are already a large literature: imbalanced and interpretable scoring [17,18], ensembles [19,20], credit-card customer models [21], stacking that brings in business knowledge [22], cross-institution imbalanced scoring [23], and XGBoost hyperparameter search [24]. This short communication does not add another accuracy contest. Prediction-first selection fixes the model by validation F1 at threshold 0.50, then tunes only the threshold. Decision-first selection chooses the model and the threshold together by validation cost. On each split, the test set is scored once, after both rules are locked. The contribution is Eq. (1), the two selection rules in Eqs. (2) and (3), and the same lock repeated on 20 stratified splits. Section 4 separates the gap between the rules from the move away from threshold 0.50. The study does not claim that decision-first selection is uniformly superior. The comparison uses the public Default of Credit Card Clients file [25,26].</w:t>
+        <w:t xml:space="preserve">, </w:t>
+      </w:r>
+      <w:r>
+        <w:rPr>
+          <w:rFonts w:ascii="Times New Roman" w:hAnsi="Times New Roman" w:cs="Times New Roman" w:eastAsia="Times New Roman"/>
+          <w:b w:val="0"/>
+          <w:i/>
+          <w:sz w:val="24"/>
+        </w:rPr>
+        <w:t>t</w:t>
+      </w:r>
+      <w:r>
+        <w:rPr>
+          <w:rFonts w:ascii="Times New Roman" w:hAnsi="Times New Roman" w:cs="Times New Roman" w:eastAsia="Times New Roman"/>
+          <w:b w:val="0"/>
+          <w:i w:val="0"/>
+          <w:sz w:val="24"/>
+        </w:rPr>
+        <w:t>). The contribution is Eq. (1), the two rules in Eqs. (2) and (3), and the same lock on 20 stratified splits of the public Default of Credit Card Clients file [25,26]. Decision-first selection is not claimed to be uniformly superior.</w:t>
       </w:r>
     </w:p>
     <w:p>
@@ -487,7 +508,25 @@
           <w:i w:val="0"/>
           <w:sz w:val="24"/>
         </w:rPr>
-        <w:t xml:space="preserve"> ∈ {2, 5, 10, 20}. The threshold grid is </w:t>
+        <w:t xml:space="preserve"> ∈ {2, 5, 10, 20}. If a score is treated as a probability, Eq. (1) is minimized at the reference threshold 1/(1+</w:t>
+      </w:r>
+      <w:r>
+        <w:rPr>
+          <w:rFonts w:ascii="Times New Roman" w:hAnsi="Times New Roman" w:cs="Times New Roman" w:eastAsia="Times New Roman"/>
+          <w:b w:val="0"/>
+          <w:i/>
+          <w:sz w:val="24"/>
+        </w:rPr>
+        <w:t>r</w:t>
+      </w:r>
+      <w:r>
+        <w:rPr>
+          <w:rFonts w:ascii="Times New Roman" w:hAnsi="Times New Roman" w:cs="Times New Roman" w:eastAsia="Times New Roman"/>
+          <w:b w:val="0"/>
+          <w:i w:val="0"/>
+          <w:sz w:val="24"/>
+        </w:rPr>
+        <w:t xml:space="preserve">): 0.33, 0.17, 0.09, and 0.05. The grid search does not impose that formula. The threshold grid is </w:t>
       </w:r>
       <w:r>
         <w:rPr>
@@ -873,7 +912,7 @@
           <w:i w:val="0"/>
           <w:sz w:val="24"/>
         </w:rPr>
-        <w:t xml:space="preserve">If several models share the highest validation F1 at 0.50, the tie is broken by the lower validation cost at that same threshold for the </w:t>
+        <w:t xml:space="preserve">F1 at 0.50 is a different objective from the cost minimized in the second line, so the model is chosen under one rule and then operated under another. If several models share the highest validation F1 at 0.50, the tie is broken by the lower validation cost at that same threshold for the </w:t>
       </w:r>
       <w:r>
         <w:rPr>
@@ -1193,7 +1232,7 @@
           <w:i w:val="0"/>
           <w:sz w:val="24"/>
         </w:rPr>
-        <w:t>The source file is the UCI Default of Credit Card Clients workbook [25,26]. It has 30,000 accounts and 6,636 defaults (22.12%). The same file is still used for predictive comparisons [27]. The identifier column is dropped. The public file contains SEX. Algorithmic bias in credit scoring support systems is an active design problem [28]. SEX is removed before the split because a credit decision policy should not use sex, and this study does not estimate a sex effect. The other 22 predictors are kept as the numeric codes in the file, including education, marriage, age, recent repayment status, bill amounts, and payment amounts.</w:t>
+        <w:t>The source file is the UCI Default of Credit Card Clients workbook [25,26]. It has 30,000 accounts and 6,636 defaults (22.12%). The same file is still used for predictive comparisons [27]. The identifier column is dropped. The public file contains SEX. Algorithmic bias in credit scoring support systems is an active design problem [28]. SEX is removed before the split because a credit decision policy should not use sex, and this study does not estimate a sex effect. Excluding SEX blocks its direct use. It does not establish algorithmic fairness, because other predictors may carry proxy information. A formal fairness assessment is outside this study. The other 22 predictors are kept as the numeric codes in the file, including education, marriage, age, recent repayment status, bill amounts, and payment amounts.</w:t>
       </w:r>
     </w:p>
     <w:p>
@@ -1241,7 +1280,7 @@
           <w:i w:val="0"/>
           <w:sz w:val="24"/>
         </w:rPr>
-        <w:t xml:space="preserve"> = 1, after a standardizer, with the library's default L2 penalty. The other models are a random forest (200 trees, depth 10, minimum leaf size 5), histogram gradient boosting (200 iterations, depth 6, learning rate 0.1), and XGBoost (200 trees, depth 5, learning rate 0.1). Thresholds run from 0.01 to 0.99 in steps of 0.01. The decision predicts default when the probability is at least the threshold.</w:t>
+        <w:t xml:space="preserve"> = 1, after a standardizer, with the library's default L2 penalty. The other models are a random forest (200 trees, depth 10, minimum leaf size 5), histogram gradient boosting (200 iterations, depth 6, learning rate 0.1), and XGBoost (200 trees, depth 5, learning rate 0.1). Thresholds run from 0.01 to 0.99 in steps of 0.01. The decision predicts default when the probability is at least the threshold. Validation Brier scores, which did not enter selection, were 0.1456 for logistic regression, 0.1342 for the random forest, 0.1368 for histogram gradient boosting, and 0.1356 for XGBoost. The four scores lie in a narrow band. That is not a formal calibration proof. For ratio 20 only, a sensitivity repeats the validation search on thresholds 0.001 to 0.009 in steps of 0.001 and keeps the lower validation cost. The primary tables stay on the original grid.</w:t>
       </w:r>
     </w:p>
     <w:p>
@@ -1256,7 +1295,7 @@
           <w:i w:val="0"/>
           <w:sz w:val="24"/>
         </w:rPr>
-        <w:t>Uncertainty is a paired bootstrap of the test accounts: 1,000 resamples, percentile interval from 2.5 to 97.5, seed 42. The same resamples are used for every contrast. The procedure does not refit models and does not rerun selection, so the interval is conditional on the locked rules. It asks whether the test-cost gap is stable to resampling of this test set. The reported contrasts are the strategy difference, test cost of A minus test cost of B, and, for the prediction-first model only, test cost at threshold 0.50 minus test cost at the tuned threshold. A positive strategy difference means decision-first selection has the lower test cost. The relative difference is that gap divided by the prediction-first test cost. If an interval includes zero, the difference is not statistically conclusive. Seeds 42 through 61 repeat the same stratified sizes, 20 splits in total, with the model random seed held at 42. The bootstrap is not recomputed. The minimum, median, and maximum across those splits are a stability range. They are not a confidence interval.</w:t>
+        <w:t>Uncertainty is a paired bootstrap of the test accounts: 1,000 resamples, percentile interval from 2.5 to 97.5, seed 42. The same resamples are used for every contrast. The procedure does not refit models and does not rerun selection, so the interval is conditional on the locked rules. It asks whether the test-cost gap is stable to resampling of this test set. The reported contrasts are the strategy difference, test cost of A minus test cost of B, and, for the prediction-first model only, test cost at threshold 0.50 minus test cost at the tuned threshold. A positive strategy difference means decision-first selection has the lower test cost. The relative difference is that gap divided by the prediction-first test cost. If an interval includes zero, the difference is not statistically conclusive. Seeds 42 through 61 repeat the same stratified sizes, 20 splits in total, with the model random seed held at 42. The minimum, median, and maximum across those splits are a stability range. They are not a confidence interval. A separate percentile bootstrap, also 1,000 resamples and seed 42, intervals the mean of the 20 split-level differences. That interval describes these partitions of this file. It is not the seed-42 test-set bootstrap.</w:t>
       </w:r>
     </w:p>
     <w:p>
@@ -3265,7 +3304,7 @@
           <w:i w:val="0"/>
           <w:sz w:val="24"/>
         </w:rPr>
-        <w:t xml:space="preserve">On the locked test split, the strategy gap is small relative to the cost of staying at threshold 0.50 (Table 2 and Figure 2). At </w:t>
+        <w:t xml:space="preserve">The larger change is the threshold, not the selector (Table 2 and Figure 2). For the prediction-first model, test cost at threshold 0.50 versus the tuned threshold moves from 0.3272 to 0.3163 at </w:t>
       </w:r>
       <w:r>
         <w:rPr>
@@ -3283,7 +3322,97 @@
           <w:i w:val="0"/>
           <w:sz w:val="24"/>
         </w:rPr>
-        <w:t xml:space="preserve"> = 2, decision-first selection reaches test cost 0.3035 and prediction-first selection reaches 0.3163. The relative difference is 0.0406. The 95% interval for the cost difference is 0.0050 to 0.0210 and excludes zero, so this difference is statistically conclusive on the present test set. At </w:t>
+        <w:t xml:space="preserve"> = 2, from 0.7522 to 0.5762 at </w:t>
+      </w:r>
+      <w:r>
+        <w:rPr>
+          <w:rFonts w:ascii="Times New Roman" w:hAnsi="Times New Roman" w:cs="Times New Roman" w:eastAsia="Times New Roman"/>
+          <w:b w:val="0"/>
+          <w:i/>
+          <w:sz w:val="24"/>
+        </w:rPr>
+        <w:t>r</w:t>
+      </w:r>
+      <w:r>
+        <w:rPr>
+          <w:rFonts w:ascii="Times New Roman" w:hAnsi="Times New Roman" w:cs="Times New Roman" w:eastAsia="Times New Roman"/>
+          <w:b w:val="0"/>
+          <w:i w:val="0"/>
+          <w:sz w:val="24"/>
+        </w:rPr>
+        <w:t xml:space="preserve"> = 5, from 1.4605 to 0.7392 at </w:t>
+      </w:r>
+      <w:r>
+        <w:rPr>
+          <w:rFonts w:ascii="Times New Roman" w:hAnsi="Times New Roman" w:cs="Times New Roman" w:eastAsia="Times New Roman"/>
+          <w:b w:val="0"/>
+          <w:i/>
+          <w:sz w:val="24"/>
+        </w:rPr>
+        <w:t>r</w:t>
+      </w:r>
+      <w:r>
+        <w:rPr>
+          <w:rFonts w:ascii="Times New Roman" w:hAnsi="Times New Roman" w:cs="Times New Roman" w:eastAsia="Times New Roman"/>
+          <w:b w:val="0"/>
+          <w:i w:val="0"/>
+          <w:sz w:val="24"/>
+        </w:rPr>
+        <w:t xml:space="preserve"> = 10, and from 2.8772 to 0.7815 at </w:t>
+      </w:r>
+      <w:r>
+        <w:rPr>
+          <w:rFonts w:ascii="Times New Roman" w:hAnsi="Times New Roman" w:cs="Times New Roman" w:eastAsia="Times New Roman"/>
+          <w:b w:val="0"/>
+          <w:i/>
+          <w:sz w:val="24"/>
+        </w:rPr>
+        <w:t>r</w:t>
+      </w:r>
+      <w:r>
+        <w:rPr>
+          <w:rFonts w:ascii="Times New Roman" w:hAnsi="Times New Roman" w:cs="Times New Roman" w:eastAsia="Times New Roman"/>
+          <w:b w:val="0"/>
+          <w:i w:val="0"/>
+          <w:sz w:val="24"/>
+        </w:rPr>
+        <w:t xml:space="preserve"> = 20. The seed-42 interval includes zero at </w:t>
+      </w:r>
+      <w:r>
+        <w:rPr>
+          <w:rFonts w:ascii="Times New Roman" w:hAnsi="Times New Roman" w:cs="Times New Roman" w:eastAsia="Times New Roman"/>
+          <w:b w:val="0"/>
+          <w:i/>
+          <w:sz w:val="24"/>
+        </w:rPr>
+        <w:t>r</w:t>
+      </w:r>
+      <w:r>
+        <w:rPr>
+          <w:rFonts w:ascii="Times New Roman" w:hAnsi="Times New Roman" w:cs="Times New Roman" w:eastAsia="Times New Roman"/>
+          <w:b w:val="0"/>
+          <w:i w:val="0"/>
+          <w:sz w:val="24"/>
+        </w:rPr>
+        <w:t xml:space="preserve"> = 2, so that difference is not statistically conclusive, and excludes zero at the three higher ratios. The strategy gap is smaller. At </w:t>
+      </w:r>
+      <w:r>
+        <w:rPr>
+          <w:rFonts w:ascii="Times New Roman" w:hAnsi="Times New Roman" w:cs="Times New Roman" w:eastAsia="Times New Roman"/>
+          <w:b w:val="0"/>
+          <w:i/>
+          <w:sz w:val="24"/>
+        </w:rPr>
+        <w:t>r</w:t>
+      </w:r>
+      <w:r>
+        <w:rPr>
+          <w:rFonts w:ascii="Times New Roman" w:hAnsi="Times New Roman" w:cs="Times New Roman" w:eastAsia="Times New Roman"/>
+          <w:b w:val="0"/>
+          <w:i w:val="0"/>
+          <w:sz w:val="24"/>
+        </w:rPr>
+        <w:t xml:space="preserve"> = 2, decision-first selection reaches test cost 0.3035 and prediction-first selection reaches 0.3163. The relative difference is 0.0406. The 95% interval for the cost difference is 0.0050 to 0.0210 and excludes zero. At </w:t>
       </w:r>
       <w:r>
         <w:rPr>
@@ -5485,7 +5614,7 @@
           <w:i w:val="0"/>
           <w:sz w:val="24"/>
         </w:rPr>
-        <w:t xml:space="preserve">The larger change is the threshold, not the selector. Figure 2 shows the prediction-first threshold moving from 0.50 down to 0.31, 0.16, 0.09, and 0.01. At </w:t>
+        <w:t>The chosen thresholds sit beside the reference 1/(1+</w:t>
       </w:r>
       <w:r>
         <w:rPr>
@@ -5503,7 +5632,7 @@
           <w:i w:val="0"/>
           <w:sz w:val="24"/>
         </w:rPr>
-        <w:t xml:space="preserve"> = 2, test cost moves from 0.3272 at threshold 0.50 to 0.3163 at the tuned threshold, and that interval includes zero, so the difference is not statistically conclusive. At </w:t>
+        <w:t xml:space="preserve">) at the first three ratios: 0.31 and 0.30 against 0.33, 0.16 and 0.16 against 0.17, and 0.09 and 0.10 against 0.09. At </w:t>
       </w:r>
       <w:r>
         <w:rPr>
@@ -5521,43 +5650,7 @@
           <w:i w:val="0"/>
           <w:sz w:val="24"/>
         </w:rPr>
-        <w:t xml:space="preserve"> = 5, </w:t>
-      </w:r>
-      <w:r>
-        <w:rPr>
-          <w:rFonts w:ascii="Times New Roman" w:hAnsi="Times New Roman" w:cs="Times New Roman" w:eastAsia="Times New Roman"/>
-          <w:b w:val="0"/>
-          <w:i/>
-          <w:sz w:val="24"/>
-        </w:rPr>
-        <w:t>r</w:t>
-      </w:r>
-      <w:r>
-        <w:rPr>
-          <w:rFonts w:ascii="Times New Roman" w:hAnsi="Times New Roman" w:cs="Times New Roman" w:eastAsia="Times New Roman"/>
-          <w:b w:val="0"/>
-          <w:i w:val="0"/>
-          <w:sz w:val="24"/>
-        </w:rPr>
-        <w:t xml:space="preserve"> = 10, and </w:t>
-      </w:r>
-      <w:r>
-        <w:rPr>
-          <w:rFonts w:ascii="Times New Roman" w:hAnsi="Times New Roman" w:cs="Times New Roman" w:eastAsia="Times New Roman"/>
-          <w:b w:val="0"/>
-          <w:i/>
-          <w:sz w:val="24"/>
-        </w:rPr>
-        <w:t>r</w:t>
-      </w:r>
-      <w:r>
-        <w:rPr>
-          <w:rFonts w:ascii="Times New Roman" w:hAnsi="Times New Roman" w:cs="Times New Roman" w:eastAsia="Times New Roman"/>
-          <w:b w:val="0"/>
-          <w:i w:val="0"/>
-          <w:sz w:val="24"/>
-        </w:rPr>
-        <w:t xml:space="preserve"> = 20, the same contrast falls from 0.7522 to 0.5762, from 1.4605 to 0.7392, and from 2.8772 to 0.7815. Those three intervals exclude zero. Once a missed default is several times as costly as a false alarm, publishing a cost-tuned threshold changes the test cost by more than the choice between the two selectors.</w:t>
+        <w:t xml:space="preserve"> = 20 the reference is 0.05, but prediction-first selection stops at 0.01, the bottom of the primary grid, which is also selected on 6 of the 20 splits. On the added grid from 0.001 to 0.009, the seed-42 search moves that rule from 0.01 to 0.009 (validation cost 0.7718, against 0.7728). The test cost is 0.7835, against 0.7815 at 0.01, so the extra step does not lower test cost. Prediction-first selection moves below 0.01 on 9 of the 20 splits. Decision-first selection stays at 0.06 on the seed-42 split and moves below 0.01 on 1 of the 20 splits.</w:t>
       </w:r>
     </w:p>
     <w:p>
@@ -5572,7 +5665,7 @@
           <w:i w:val="0"/>
           <w:sz w:val="24"/>
         </w:rPr>
-        <w:t xml:space="preserve">Figure 1 is the validation cost curve that produces the prediction-first thresholds on the seed-42 split. The circle is the minimizing threshold, labeled with its value, and the dotted line is 0.50. The curve falls as the threshold leaves 0.50, then rises. The same selection was repeated on seeds 42 through 61. The prediction-first model was histogram gradient boosting on 12 splits, XGBoost on 6, and the random forest on 2. No split used the cost tie-break. Prediction-first thresholds ranged from 0.30 to 0.38 at </w:t>
+        <w:t xml:space="preserve">Across seeds 42 through 61, the prediction-first model was histogram gradient boosting on 12 splits, XGBoost on 6, and the random forest on 2. No split used the cost tie-break. Prediction-first thresholds ranged from 0.30 to 0.38 at </w:t>
       </w:r>
       <w:r>
         <w:rPr>
@@ -5644,7 +5737,7 @@
           <w:i w:val="0"/>
           <w:sz w:val="24"/>
         </w:rPr>
-        <w:t xml:space="preserve"> = 20. Decision-first selection chose the random forest on 18, 12, 17, and 18 of the 20 splits. Table 2 gives the min, median, and max of the test costs. The whiskers in Figure 2 are those minima and maxima. They are not a confidence interval. The bootstrap intervals apply only to seed 42.</w:t>
+        <w:t xml:space="preserve"> = 20. Decision-first selection chose the random forest on 18, 12, 17, and 18 of the 20 splits. Prediction-first test cost was strictly lower on 5, 10, 4, and 1 of the 20 splits, with 2, 3, 3, and 2 ties. The mean gain from leaving threshold 0.50 was 0.0145, 0.1797, 0.7184, and 2.0446, with intervals [0.0118, 0.0170], [0.1739, 0.1852], [0.7043, 0.7324], and [2.0173, 2.0735]. None included zero. The mean strategy gap, prediction-first cost minus decision-first cost, was 0.0028, −0.0006, 0.0157, and 0.0196, with intervals [0.0013, 0.0047], [−0.0055, 0.0040], [0.0083, 0.0242], and [0.0110, 0.0297]. Only the ratio-5 interval included zero. At ratios 5, 10, and 20 the mean gain from leaving 0.50 is an order of magnitude larger than the mean gap between the rules. Whiskers in Figure 2 are minima and maxima, not a confidence interval.</w:t>
       </w:r>
     </w:p>
     <w:p>
@@ -5789,7 +5882,7 @@
           <w:color w:val="366091"/>
           <w:sz w:val="24"/>
         </w:rPr>
-        <w:t>5. Implications for entrepreneurial credit decisions</w:t>
+        <w:t>5. Implications for the operating decision</w:t>
       </w:r>
     </w:p>
     <w:p>
@@ -5804,7 +5897,7 @@
           <w:i w:val="0"/>
           <w:sz w:val="24"/>
         </w:rPr>
-        <w:t xml:space="preserve">A credit operation, including a smaller lending venture, writes down </w:t>
+        <w:t xml:space="preserve">The chain is probability, preference, policy, then action. The model estimates a default probability, the knowledge layer states </w:t>
       </w:r>
       <w:r>
         <w:rPr>
@@ -5822,7 +5915,43 @@
           <w:i w:val="0"/>
           <w:sz w:val="24"/>
         </w:rPr>
-        <w:t xml:space="preserve"> and publishes the threshold from Eq. (2) or Eq. (3). On this file, </w:t>
+        <w:t xml:space="preserve">, the decision layer returns </w:t>
+      </w:r>
+      <w:r>
+        <w:rPr>
+          <w:rFonts w:ascii="Times New Roman" w:hAnsi="Times New Roman" w:cs="Times New Roman" w:eastAsia="Times New Roman"/>
+          <w:b w:val="0"/>
+          <w:i/>
+          <w:sz w:val="24"/>
+        </w:rPr>
+        <w:t>t</w:t>
+      </w:r>
+      <w:r>
+        <w:rPr>
+          <w:rFonts w:ascii="Times New Roman" w:hAnsi="Times New Roman" w:cs="Times New Roman" w:eastAsia="Times New Roman"/>
+          <w:b w:val="0"/>
+          <w:i w:val="0"/>
+          <w:sz w:val="24"/>
+        </w:rPr>
+        <w:t xml:space="preserve">, and the action predicts default when the probability is at least </w:t>
+      </w:r>
+      <w:r>
+        <w:rPr>
+          <w:rFonts w:ascii="Times New Roman" w:hAnsi="Times New Roman" w:cs="Times New Roman" w:eastAsia="Times New Roman"/>
+          <w:b w:val="0"/>
+          <w:i/>
+          <w:sz w:val="24"/>
+        </w:rPr>
+        <w:t>t</w:t>
+      </w:r>
+      <w:r>
+        <w:rPr>
+          <w:rFonts w:ascii="Times New Roman" w:hAnsi="Times New Roman" w:cs="Times New Roman" w:eastAsia="Times New Roman"/>
+          <w:b w:val="0"/>
+          <w:i w:val="0"/>
+          <w:sz w:val="24"/>
+        </w:rPr>
+        <w:t xml:space="preserve">. When </w:t>
       </w:r>
       <w:r>
         <w:rPr>
@@ -5840,7 +5969,25 @@
           <w:i w:val="0"/>
           <w:sz w:val="24"/>
         </w:rPr>
-        <w:t xml:space="preserve"> = 10 moves the prediction-first rule from 0.50 to 0.09. Online consumer credit is already framed as a risk-management task [29]. Digital-transformation research treats the organizational resource, rather than the software alone, as what has to change [30]. Here that resource is the pair (</w:t>
+        <w:t xml:space="preserve"> changes, the same model can keep its probabilities and publish a new threshold. On this file, </w:t>
+      </w:r>
+      <w:r>
+        <w:rPr>
+          <w:rFonts w:ascii="Times New Roman" w:hAnsi="Times New Roman" w:cs="Times New Roman" w:eastAsia="Times New Roman"/>
+          <w:b w:val="0"/>
+          <w:i/>
+          <w:sz w:val="24"/>
+        </w:rPr>
+        <w:t>r</w:t>
+      </w:r>
+      <w:r>
+        <w:rPr>
+          <w:rFonts w:ascii="Times New Roman" w:hAnsi="Times New Roman" w:cs="Times New Roman" w:eastAsia="Times New Roman"/>
+          <w:b w:val="0"/>
+          <w:i w:val="0"/>
+          <w:sz w:val="24"/>
+        </w:rPr>
+        <w:t xml:space="preserve"> = 10 moves the prediction-first rule from 0.50 to 0.09. An organization with a probability model does not, on this evidence, need to replace that model every time the cost ratio changes. Online consumer credit is already a risk-management task [29]. Research on digital transformation treats the organizational resource, rather than the software alone, as what has to change [30]. Here that resource is the pair (</w:t>
       </w:r>
       <w:r>
         <w:rPr>
@@ -5876,7 +6023,7 @@
           <w:i w:val="0"/>
           <w:sz w:val="24"/>
         </w:rPr>
-        <w:t xml:space="preserve">). The UCI file contains Taiwanese credit-card clients [25]. It is not a startup portfolio, and </w:t>
+        <w:t xml:space="preserve">). The file contains Taiwanese credit-card clients [25], not a startup portfolio, and </w:t>
       </w:r>
       <w:r>
         <w:rPr>
@@ -5925,25 +6072,7 @@
           <w:i w:val="0"/>
           <w:sz w:val="24"/>
         </w:rPr>
-        <w:t xml:space="preserve">The useful output is a threshold tied to a stated cost ratio. Decision-first selection was conclusively cheaper only at </w:t>
-      </w:r>
-      <w:r>
-        <w:rPr>
-          <w:rFonts w:ascii="Times New Roman" w:hAnsi="Times New Roman" w:cs="Times New Roman" w:eastAsia="Times New Roman"/>
-          <w:b w:val="0"/>
-          <w:i/>
-          <w:sz w:val="24"/>
-        </w:rPr>
-        <w:t>r</w:t>
-      </w:r>
-      <w:r>
-        <w:rPr>
-          <w:rFonts w:ascii="Times New Roman" w:hAnsi="Times New Roman" w:cs="Times New Roman" w:eastAsia="Times New Roman"/>
-          <w:b w:val="0"/>
-          <w:i w:val="0"/>
-          <w:sz w:val="24"/>
-        </w:rPr>
-        <w:t xml:space="preserve"> = 2. At </w:t>
+        <w:t xml:space="preserve">The useful output is a threshold tied to a stated cost ratio. On the seed-42 test set, leaving threshold 0.50 reduced cost by a margin whose interval excluded zero at </w:t>
       </w:r>
       <w:r>
         <w:rPr>
@@ -5997,7 +6126,7 @@
           <w:i w:val="0"/>
           <w:sz w:val="24"/>
         </w:rPr>
-        <w:t xml:space="preserve"> = 20, the strategy difference was not statistically conclusive. Across seeds 42 through 61, tuned test cost was lower than the cost at 0.50 on all 20 splits at the three higher ratios, and that range is not a confidence interval. The </w:t>
+        <w:t xml:space="preserve"> = 20, and the strategy difference was not statistically conclusive at those three ratios. At </w:t>
       </w:r>
       <w:r>
         <w:rPr>
@@ -6015,7 +6144,43 @@
           <w:i w:val="0"/>
           <w:sz w:val="24"/>
         </w:rPr>
-        <w:t xml:space="preserve"> = 20 prediction-first threshold sits on the lower edge of the grid. SEX was excluded from the predictors and was not used to estimate a sex effect.</w:t>
+        <w:t xml:space="preserve"> = 5 the point estimate favored prediction-first selection. Across seeds 42 through 61, the mean gain from leaving 0.50 excluded zero at every ratio, including </w:t>
+      </w:r>
+      <w:r>
+        <w:rPr>
+          <w:rFonts w:ascii="Times New Roman" w:hAnsi="Times New Roman" w:cs="Times New Roman" w:eastAsia="Times New Roman"/>
+          <w:b w:val="0"/>
+          <w:i/>
+          <w:sz w:val="24"/>
+        </w:rPr>
+        <w:t>r</w:t>
+      </w:r>
+      <w:r>
+        <w:rPr>
+          <w:rFonts w:ascii="Times New Roman" w:hAnsi="Times New Roman" w:cs="Times New Roman" w:eastAsia="Times New Roman"/>
+          <w:b w:val="0"/>
+          <w:i w:val="0"/>
+          <w:sz w:val="24"/>
+        </w:rPr>
+        <w:t xml:space="preserve"> = 2, where the seed-42 test interval still included zero. Those are different questions, and the min-to-max range is not a confidence interval. Extending the </w:t>
+      </w:r>
+      <w:r>
+        <w:rPr>
+          <w:rFonts w:ascii="Times New Roman" w:hAnsi="Times New Roman" w:cs="Times New Roman" w:eastAsia="Times New Roman"/>
+          <w:b w:val="0"/>
+          <w:i/>
+          <w:sz w:val="24"/>
+        </w:rPr>
+        <w:t>r</w:t>
+      </w:r>
+      <w:r>
+        <w:rPr>
+          <w:rFonts w:ascii="Times New Roman" w:hAnsi="Times New Roman" w:cs="Times New Roman" w:eastAsia="Times New Roman"/>
+          <w:b w:val="0"/>
+          <w:i w:val="0"/>
+          <w:sz w:val="24"/>
+        </w:rPr>
+        <w:t xml:space="preserve"> = 20 grid to 0.009 did not lower seed-42 test cost. The validation Brier scores are close, which is not a calibration proof. SEX was excluded from the predictors, was not used to estimate a sex effect, and that exclusion does not establish fairness.</w:t>
       </w:r>
     </w:p>
     <w:p>

</xml_diff>

<commit_message>
Sharpen the argument around threshold versus model choice.
State the gap from the cost-sensitive and profit-driven literature, define the contribution as the separation of those two values, and treat the 20-split intervals as partition stability on this file. Interpret the ratio-20 grid extension and spell out probability, preference, policy, and action.

Co-authored-by: pravallikanalluri9848 <pravallikanalluri9848@gmail.com>
</commit_message>
<xml_diff>
--- a/Nalluri_KBS_SourceFile.docx
+++ b/Nalluri_KBS_SourceFile.docx
@@ -105,7 +105,7 @@
           <w:i w:val="0"/>
           <w:sz w:val="24"/>
         </w:rPr>
-        <w:t>A predicted probability is not a credit decision. After the models are fit, this study separates which model to keep from which threshold turns its probability into an action. The knowledge is one false-negative cost ratio, fixed before any test account is scored. On the UCI credit-card default file (30,000 accounts; 6,636 defaults, 22.12%), four models were fit without class weights. Prediction-first selection kept histogram gradient boosting, the highest validation F1 at threshold 0.50 (0.4682), then tuned only its threshold. Decision-first selection searched every model and threshold for the lowest validation cost. Leaving 0.50 cut test cost from 0.7522 to 0.5762 at ratio 5, from 1.4605 to 0.7392 at ratio 10, and from 2.8772 to 0.7815 at ratio 20; those intervals excluded zero. At ratio 2 the threshold contrast was not statistically conclusive. Decision-first selection was cheaper at ratio 2 (relative difference 0.0406; interval 0.0050 to 0.0210). At ratios 5, 10, and 20 the strategy interval included zero. Across 20 splits (seeds 42 through 61) the mean gain from leaving 0.50 excluded zero at every ratio and exceeded the mean gap between the rules. The public file is not a startup portfolio.</w:t>
+        <w:t>A predicted probability is not a credit decision. After the models are fit, this study separates which model to keep from which threshold turns its probability into an action. The knowledge is one false-negative cost ratio, fixed before any test account is scored. On the UCI credit-card default file (30,000 accounts; 6,636 defaults, 22.12%), four models were fit without class weights. Prediction-first selection kept histogram gradient boosting, the highest validation F1 at threshold 0.50 (0.4682), then tuned only its threshold. Decision-first selection searched every model and threshold for the lowest validation cost. Leaving 0.50 cut test cost from 0.7522 to 0.5762 at ratio 5, from 1.4605 to 0.7392 at ratio 10, and from 2.8772 to 0.7815 at ratio 20; those intervals excluded zero. At ratio 2 the threshold contrast was not statistically conclusive. Decision-first selection was cheaper at ratio 2 (relative difference 0.0406; interval 0.0050 to 0.0210). At ratios 5, 10, and 20 the strategy interval included zero. Across 20 stratified splits (seeds 42 through 61), threshold tuning produced a positive mean cost reduction at every ratio, and at ratios 5, 10, and 20 that gain exceeded the model-selection gap by more than an order of magnitude. The public file is not a startup portfolio.</w:t>
       </w:r>
     </w:p>
     <w:p>
@@ -251,7 +251,7 @@
           <w:i w:val="0"/>
           <w:sz w:val="24"/>
         </w:rPr>
-        <w:t>A probability of default is not a credit decision. Accuracy comparisons, cost-sensitive training, class-imbalance corrections, and profit-driven scoring are already a large literature [1–24]. Less attention has been given to two choices made after the fit: which model to keep, and which threshold turns its probability into an action under a stated cost ratio. This short communication does not add another accuracy contest. It asks whether the cost saving comes from choosing a different model, or from changing the threshold of a model already chosen.</w:t>
+        <w:t>A probability of default is not a credit decision. Accuracy comparisons, cost-sensitive training, class-imbalance corrections, and profit-driven scoring are already a large literature [1–24]. Automatic threshold learning, cost-sensitive learning, asymmetric loss, and profit-driven credit scoring do not directly isolate whether an out-of-sample cost improvement comes from changing the predictive model or from changing the operating threshold of a model already selected [2,4–10]. This short communication runs that comparison. It does not add another accuracy contest.</w:t>
       </w:r>
     </w:p>
     <w:p>
@@ -302,7 +302,7 @@
           <w:i w:val="0"/>
           <w:sz w:val="24"/>
         </w:rPr>
-        <w:t>). The contribution is Eq. (1), the two rules in Eqs. (2) and (3), and the same lock on 20 stratified splits of the public Default of Credit Card Clients file [25,26]. Decision-first selection is not claimed to be uniformly superior.</w:t>
+        <w:t>). The contribution is that controlled separation of model-selection value from threshold-selection value under one asymmetric cost (Eqs. (1)–(3)), with the holdout locked before scoring and with repeated-split evidence on which component accounts for the larger cost improvement. The comparison uses the public Default of Credit Card Clients file [25,26]. Decision-first selection is not claimed to be uniformly superior.</w:t>
       </w:r>
     </w:p>
     <w:p>
@@ -1295,7 +1295,7 @@
           <w:i w:val="0"/>
           <w:sz w:val="24"/>
         </w:rPr>
-        <w:t>Uncertainty is a paired bootstrap of the test accounts: 1,000 resamples, percentile interval from 2.5 to 97.5, seed 42. The same resamples are used for every contrast. The procedure does not refit models and does not rerun selection, so the interval is conditional on the locked rules. It asks whether the test-cost gap is stable to resampling of this test set. The reported contrasts are the strategy difference, test cost of A minus test cost of B, and, for the prediction-first model only, test cost at threshold 0.50 minus test cost at the tuned threshold. A positive strategy difference means decision-first selection has the lower test cost. The relative difference is that gap divided by the prediction-first test cost. If an interval includes zero, the difference is not statistically conclusive. Seeds 42 through 61 repeat the same stratified sizes, 20 splits in total, with the model random seed held at 42. The minimum, median, and maximum across those splits are a stability range. They are not a confidence interval. A separate percentile bootstrap, also 1,000 resamples and seed 42, intervals the mean of the 20 split-level differences. That interval describes these partitions of this file. It is not the seed-42 test-set bootstrap.</w:t>
+        <w:t>Uncertainty is a paired bootstrap of the test accounts: 1,000 resamples, percentile interval from 2.5 to 97.5, seed 42. The same resamples are used for every contrast. The procedure does not refit models and does not rerun selection, so the interval is conditional on the locked rules. It asks whether the test-cost gap is stable to resampling of this test set. The reported contrasts are the strategy difference, test cost of A minus test cost of B, and, for the prediction-first model only, test cost at threshold 0.50 minus test cost at the tuned threshold. A positive strategy difference means decision-first selection has the lower test cost. The relative difference is that gap divided by the prediction-first test cost. If an interval includes zero, the difference is not statistically conclusive. Seeds 42 through 61 repeat the same stratified sizes, 20 splits in total, with the model random seed held at 42. The minimum, median, and maximum across those splits are a stability range. They are not a confidence interval. A separate percentile bootstrap of the mean of the 20 split-level differences, also 1,000 resamples and seed 42, describes these partitions of this file. It measures partition stability, not population replication: every split reuses the same 30,000 accounts, so the splits are not independent datasets. It is not the seed-42 test-set bootstrap.</w:t>
       </w:r>
     </w:p>
     <w:p>
@@ -5650,7 +5650,7 @@
           <w:i w:val="0"/>
           <w:sz w:val="24"/>
         </w:rPr>
-        <w:t xml:space="preserve"> = 20 the reference is 0.05, but prediction-first selection stops at 0.01, the bottom of the primary grid, which is also selected on 6 of the 20 splits. On the added grid from 0.001 to 0.009, the seed-42 search moves that rule from 0.01 to 0.009 (validation cost 0.7718, against 0.7728). The test cost is 0.7835, against 0.7815 at 0.01, so the extra step does not lower test cost. Prediction-first selection moves below 0.01 on 9 of the 20 splits. Decision-first selection stays at 0.06 on the seed-42 split and moves below 0.01 on 1 of the 20 splits.</w:t>
+        <w:t xml:space="preserve"> = 20 the reference is 0.05, but prediction-first selection stops at 0.01, also on 6 of the 20 splits. The 0.001 to 0.009 grid moves seed 42 from 0.01 to 0.009 (validation cost 0.7718, against 0.7728; test cost 0.7835, against 0.7815). Validation cost improves and test cost does not, so the threshold stays locked before the test accounts are scored. Prediction-first selection moves below 0.01 on 9 of the 20 splits; decision-first selection stays at 0.06 on the seed-42 split and moves below 0.01 on 1 of the 20 splits.</w:t>
       </w:r>
     </w:p>
     <w:p>
@@ -5737,7 +5737,7 @@
           <w:i w:val="0"/>
           <w:sz w:val="24"/>
         </w:rPr>
-        <w:t xml:space="preserve"> = 20. Decision-first selection chose the random forest on 18, 12, 17, and 18 of the 20 splits. Prediction-first test cost was strictly lower on 5, 10, 4, and 1 of the 20 splits, with 2, 3, 3, and 2 ties. The mean gain from leaving threshold 0.50 was 0.0145, 0.1797, 0.7184, and 2.0446, with intervals [0.0118, 0.0170], [0.1739, 0.1852], [0.7043, 0.7324], and [2.0173, 2.0735]. None included zero. The mean strategy gap, prediction-first cost minus decision-first cost, was 0.0028, −0.0006, 0.0157, and 0.0196, with intervals [0.0013, 0.0047], [−0.0055, 0.0040], [0.0083, 0.0242], and [0.0110, 0.0297]. Only the ratio-5 interval included zero. At ratios 5, 10, and 20 the mean gain from leaving 0.50 is an order of magnitude larger than the mean gap between the rules. Whiskers in Figure 2 are minima and maxima, not a confidence interval.</w:t>
+        <w:t xml:space="preserve"> = 20. Decision-first selection chose the random forest on 18, 12, 17, and 18 of the 20 splits. Prediction-first test cost was strictly lower on 5, 10, 4, and 1 of the 20 splits, with 2, 3, 3, and 2 ties. The mean gain from leaving threshold 0.50 was 0.0145, 0.1797, 0.7184, and 2.0446, with intervals [0.0118, 0.0170], [0.1739, 0.1852], [0.7043, 0.7324], and [2.0173, 2.0735]. None included zero. The mean strategy gap, prediction-first cost minus decision-first cost, was 0.0028, −0.0006, 0.0157, and 0.0196, with intervals [0.0013, 0.0047], [−0.0055, 0.0040], [0.0083, 0.0242], and [0.0110, 0.0297]. Only the ratio-5 interval included zero. At ratios 5, 10, and 20 the operating threshold accounts for an order of magnitude more of the cost improvement than the choice between the two selection rules. This describes partition stability on one file, not independent replication.</w:t>
       </w:r>
     </w:p>
     <w:p>
@@ -5897,7 +5897,7 @@
           <w:i w:val="0"/>
           <w:sz w:val="24"/>
         </w:rPr>
-        <w:t xml:space="preserve">The chain is probability, preference, policy, then action. The model estimates a default probability, the knowledge layer states </w:t>
+        <w:t xml:space="preserve">The chain is probability, preference, policy, then action. Probability is the model's learned estimate of default. Preference </w:t>
       </w:r>
       <w:r>
         <w:rPr>
@@ -5915,7 +5915,7 @@
           <w:i w:val="0"/>
           <w:sz w:val="24"/>
         </w:rPr>
-        <w:t xml:space="preserve">, the decision layer returns </w:t>
+        <w:t xml:space="preserve"> is explicit organizational knowledge, not a weight inside the classifier. Policy </w:t>
       </w:r>
       <w:r>
         <w:rPr>
@@ -5933,7 +5933,7 @@
           <w:i w:val="0"/>
           <w:sz w:val="24"/>
         </w:rPr>
-        <w:t xml:space="preserve">, and the action predicts default when the probability is at least </w:t>
+        <w:t xml:space="preserve"> is the operational rule, and the action predicts default when the probability is at least </w:t>
       </w:r>
       <w:r>
         <w:rPr>
@@ -5969,7 +5969,7 @@
           <w:i w:val="0"/>
           <w:sz w:val="24"/>
         </w:rPr>
-        <w:t xml:space="preserve"> changes, the same model can keep its probabilities and publish a new threshold. On this file, </w:t>
+        <w:t xml:space="preserve"> changes, the same probabilities support a new policy: on this file, </w:t>
       </w:r>
       <w:r>
         <w:rPr>
@@ -5987,7 +5987,7 @@
           <w:i w:val="0"/>
           <w:sz w:val="24"/>
         </w:rPr>
-        <w:t xml:space="preserve"> = 10 moves the prediction-first rule from 0.50 to 0.09. An organization with a probability model does not, on this evidence, need to replace that model every time the cost ratio changes. Online consumer credit is already a risk-management task [29]. Research on digital transformation treats the organizational resource, rather than the software alone, as what has to change [30]. Here that resource is the pair (</w:t>
+        <w:t xml:space="preserve"> = 10 moves the prediction-first rule from 0.50 to 0.09. The model need not, on this evidence, be replaced every time the cost ratio changes. Online consumer credit is already a risk-management task [29], and digital-transformation research treats the organizational resource, rather than the software alone, as what has to change [30]. Here that resource is the pair (</w:t>
       </w:r>
       <w:r>
         <w:rPr>
@@ -6072,7 +6072,7 @@
           <w:i w:val="0"/>
           <w:sz w:val="24"/>
         </w:rPr>
-        <w:t xml:space="preserve">The useful output is a threshold tied to a stated cost ratio. On the seed-42 test set, leaving threshold 0.50 reduced cost by a margin whose interval excluded zero at </w:t>
+        <w:t xml:space="preserve">Under these asymmetric costs, the operating threshold accounts for more of the cost improvement than the choice among these classifiers. On the seed-42 test set, leaving threshold 0.50 reduced cost by a margin whose interval excluded zero at </w:t>
       </w:r>
       <w:r>
         <w:rPr>

</xml_diff>

<commit_message>
Lock the manuscript to the reproducible experiment.
Prediction-first selection now keeps XGBoost. Every reported cost, interval, and figure comes from that run, and the repository script checks the manuscript against results/.

Co-authored-by: pravallikanalluri9848 <pravallikanalluri9848@gmail.com>
</commit_message>
<xml_diff>
--- a/Nalluri_KBS_SourceFile.docx
+++ b/Nalluri_KBS_SourceFile.docx
@@ -105,7 +105,7 @@
           <w:i w:val="0"/>
           <w:sz w:val="24"/>
         </w:rPr>
-        <w:t>A predicted probability is not a credit decision. After the models are fit, this study separates which model to keep from which threshold turns its probability into an action. The knowledge is one false-negative cost ratio, fixed before any test account is scored. On the UCI credit-card default file (30,000 accounts; 6,636 defaults, 22.12%), four models were fit without class weights. Prediction-first selection kept histogram gradient boosting, the highest validation F1 at threshold 0.50 (0.4682), then tuned only its threshold. Decision-first selection searched every model and threshold for the lowest validation cost. Leaving 0.50 cut test cost from 0.7522 to 0.5762 at ratio 5, from 1.4605 to 0.7392 at ratio 10, and from 2.8772 to 0.7815 at ratio 20; those intervals excluded zero. At ratio 2 the threshold contrast was not statistically conclusive. Decision-first selection was cheaper at ratio 2 (relative difference 0.0406; interval 0.0050 to 0.0210). At ratios 5, 10, and 20 the strategy interval included zero. Across 20 stratified splits (seeds 42 through 61), threshold tuning produced a positive mean cost reduction at every ratio, and at ratios 5, 10, and 20 that gain exceeded the model-selection gap by more than an order of magnitude. The public file is not a startup portfolio.</w:t>
+        <w:t>A predicted probability is not a credit decision. After the models are fit, this study separates which model to keep from which threshold turns its probability into an action. The knowledge is one false-negative cost ratio, fixed before any test account is scored. On the UCI credit-card default file (30,000 accounts; 6,636 defaults, 22.12%), four models were fit without class weights. Prediction-first selection kept XGBoost, the highest validation F1 at threshold 0.50 (0.4688), then tuned only its threshold. Decision-first selection searched every model and threshold for the lowest validation cost. Leaving 0.50 cut test cost from 0.3253 to 0.3122 at ratio 2, from 0.7503 to 0.5755 at ratio 5, from 1.4587 to 0.7230 at ratio 10, and from 2.8753 to 0.7775 at ratio 20; every interval excluded zero. Decision-first selection was cheaper at ratio 2 (relative difference 0.0278; interval 0.0015 to 0.0162). At ratio 5 the two rules selected the same model and threshold. At ratios 10 and 20 the strategy interval included zero. Across 20 stratified splits (seeds 42 through 61), threshold tuning produced a positive mean cost reduction at every ratio, and at ratios 5, 10, and 20 that gain exceeded the model-selection gap by more than an order of magnitude. The public file is not a startup portfolio.</w:t>
       </w:r>
     </w:p>
     <w:p>
@@ -190,7 +190,7 @@
           <w:i w:val="0"/>
           <w:sz w:val="24"/>
         </w:rPr>
-        <w:t>• Leaving 0.50 cuts cost at ratios 5, 10, and 20 on every split.</w:t>
+        <w:t>• Leaving 0.50 cuts cost at every ratio on every split.</w:t>
       </w:r>
     </w:p>
     <w:p>
@@ -1280,7 +1280,7 @@
           <w:i w:val="0"/>
           <w:sz w:val="24"/>
         </w:rPr>
-        <w:t xml:space="preserve"> = 1, after a standardizer, with the library's default L2 penalty. The other models are a random forest (200 trees, depth 10, minimum leaf size 5), histogram gradient boosting (200 iterations, depth 6, learning rate 0.1), and XGBoost (200 trees, depth 5, learning rate 0.1). Thresholds run from 0.01 to 0.99 in steps of 0.01. The decision predicts default when the probability is at least the threshold. Validation Brier scores, which did not enter selection, were 0.1456 for logistic regression, 0.1342 for the random forest, 0.1368 for histogram gradient boosting, and 0.1356 for XGBoost. The four scores lie in a narrow band. That is not a formal calibration proof. For ratio 20 only, a sensitivity repeats the validation search on thresholds 0.001 to 0.009 in steps of 0.001 and keeps the lower validation cost. The primary tables stay on the original grid.</w:t>
+        <w:t xml:space="preserve"> = 1, after a standardizer, with the library's default L2 penalty. The other models are a random forest (200 trees, depth 10, minimum leaf size 5), histogram gradient boosting (200 iterations, depth 6, learning rate 0.1), and XGBoost (200 trees, depth 5, learning rate 0.1). Thresholds run from 0.01 to 0.99 in steps of 0.01. The decision predicts default when the probability is at least the threshold. Validation Brier scores, which did not enter selection, were 0.1456 for logistic regression, 0.1342 for the random forest, 0.1354 for histogram gradient boosting, and 0.1356 for XGBoost. The four scores lie in a narrow band. That is not a formal calibration proof. For ratio 20 only, a sensitivity repeats the prediction-first validation search on thresholds 0.001 to 0.009 in steps of 0.001 and records the lower validation cost. The primary tables stay on the original grid.</w:t>
       </w:r>
     </w:p>
     <w:p>
@@ -1326,7 +1326,7 @@
           <w:i w:val="0"/>
           <w:sz w:val="24"/>
         </w:rPr>
-        <w:t xml:space="preserve">Table 1 is the validation lock. Validation F1 at threshold 0.50 selected histogram gradient boosting. Its F1 was higher than that of the random forest, XGBoost, and logistic regression, and the four values were distinct, so the cost tie-break was not used. On this split the prediction-first model is therefore fixed for every cost ratio. As </w:t>
+        <w:t xml:space="preserve">Table 1 is the validation lock. Validation F1 at threshold 0.50 selected XGBoost. Its F1 was higher than that of histogram gradient boosting, the random forest, and logistic regression, and the four values were distinct, so the cost tie-break was not used. On this split the prediction-first model is therefore fixed for every cost ratio. As </w:t>
       </w:r>
       <w:r>
         <w:rPr>
@@ -1344,7 +1344,7 @@
           <w:i w:val="0"/>
           <w:sz w:val="24"/>
         </w:rPr>
-        <w:t xml:space="preserve"> increases, the chosen threshold falls. For histogram gradient boosting the validation thresholds are 0.31, 0.16, 0.09, and 0.01. The last of these is the bottom of the grid, so the search could not move lower. That edge is also selected on 6 of the 20 splits. Decision-first selection chooses the random forest at </w:t>
+        <w:t xml:space="preserve"> increases, the chosen threshold falls. For XGBoost the validation thresholds are 0.31, 0.15, 0.09, and 0.01. The last of these is the bottom of the grid, so the search could not move lower. That edge is also selected on 5 of the 20 splits. Decision-first selection chooses the random forest at </w:t>
       </w:r>
       <w:r>
         <w:rPr>
@@ -1398,7 +1398,7 @@
           <w:i w:val="0"/>
           <w:sz w:val="24"/>
         </w:rPr>
-        <w:t xml:space="preserve"> = 20, and XGBoost at </w:t>
+        <w:t xml:space="preserve"> = 20. At </w:t>
       </w:r>
       <w:r>
         <w:rPr>
@@ -1416,7 +1416,7 @@
           <w:i w:val="0"/>
           <w:sz w:val="24"/>
         </w:rPr>
-        <w:t xml:space="preserve"> = 5.</w:t>
+        <w:t xml:space="preserve"> = 5 it selects the same XGBoost threshold as prediction-first selection.</w:t>
       </w:r>
     </w:p>
     <w:p>
@@ -1754,7 +1754,7 @@
                 <w:i w:val="0"/>
                 <w:sz w:val="20"/>
               </w:rPr>
-              <w:t>histogram GB</w:t>
+              <w:t>XGBoost</w:t>
             </w:r>
           </w:p>
         </w:tc>
@@ -1820,7 +1820,7 @@
                 <w:i w:val="0"/>
                 <w:sz w:val="20"/>
               </w:rPr>
-              <w:t>0.3075</w:t>
+              <w:t>0.3070</w:t>
             </w:r>
           </w:p>
         </w:tc>
@@ -1853,7 +1853,7 @@
                 <w:i w:val="0"/>
                 <w:sz w:val="20"/>
               </w:rPr>
-              <w:t>0.5343</w:t>
+              <w:t>0.5358</w:t>
             </w:r>
           </w:p>
         </w:tc>
@@ -2154,7 +2154,7 @@
                 <w:i w:val="0"/>
                 <w:sz w:val="20"/>
               </w:rPr>
-              <w:t>histogram GB</w:t>
+              <w:t>XGBoost</w:t>
             </w:r>
           </w:p>
         </w:tc>
@@ -2187,7 +2187,7 @@
                 <w:i w:val="0"/>
                 <w:sz w:val="20"/>
               </w:rPr>
-              <w:t>0.16</w:t>
+              <w:t>0.15</w:t>
             </w:r>
           </w:p>
         </w:tc>
@@ -2220,7 +2220,7 @@
                 <w:i w:val="0"/>
                 <w:sz w:val="20"/>
               </w:rPr>
-              <w:t>0.5485</w:t>
+              <w:t>0.5417</w:t>
             </w:r>
           </w:p>
         </w:tc>
@@ -2253,7 +2253,7 @@
                 <w:i w:val="0"/>
                 <w:sz w:val="20"/>
               </w:rPr>
-              <w:t>0.5050</w:t>
+              <w:t>0.4995</w:t>
             </w:r>
           </w:p>
         </w:tc>
@@ -2387,7 +2387,7 @@
                 <w:i w:val="0"/>
                 <w:sz w:val="20"/>
               </w:rPr>
-              <w:t>0.16</w:t>
+              <w:t>0.15</w:t>
             </w:r>
           </w:p>
         </w:tc>
@@ -2420,7 +2420,7 @@
                 <w:i w:val="0"/>
                 <w:sz w:val="20"/>
               </w:rPr>
-              <w:t>0.5318</w:t>
+              <w:t>0.5417</w:t>
             </w:r>
           </w:p>
         </w:tc>
@@ -2453,7 +2453,7 @@
                 <w:i w:val="0"/>
                 <w:sz w:val="20"/>
               </w:rPr>
-              <w:t>0.5126</w:t>
+              <w:t>0.4995</w:t>
             </w:r>
           </w:p>
         </w:tc>
@@ -2554,7 +2554,7 @@
                 <w:i w:val="0"/>
                 <w:sz w:val="20"/>
               </w:rPr>
-              <w:t>histogram GB</w:t>
+              <w:t>XGBoost</w:t>
             </w:r>
           </w:p>
         </w:tc>
@@ -2620,7 +2620,7 @@
                 <w:i w:val="0"/>
                 <w:sz w:val="20"/>
               </w:rPr>
-              <w:t>0.7065</w:t>
+              <w:t>0.7083</w:t>
             </w:r>
           </w:p>
         </w:tc>
@@ -2653,7 +2653,7 @@
                 <w:i w:val="0"/>
                 <w:sz w:val="20"/>
               </w:rPr>
-              <w:t>0.4414</w:t>
+              <w:t>0.4333</w:t>
             </w:r>
           </w:p>
         </w:tc>
@@ -2954,7 +2954,7 @@
                 <w:i w:val="0"/>
                 <w:sz w:val="20"/>
               </w:rPr>
-              <w:t>histogram GB</w:t>
+              <w:t>XGBoost</w:t>
             </w:r>
           </w:p>
         </w:tc>
@@ -3020,7 +3020,7 @@
                 <w:i w:val="0"/>
                 <w:sz w:val="20"/>
               </w:rPr>
-              <w:t>0.7728</w:t>
+              <w:t>0.7778</w:t>
             </w:r>
           </w:p>
         </w:tc>
@@ -3053,7 +3053,7 @@
                 <w:i w:val="0"/>
                 <w:sz w:val="20"/>
               </w:rPr>
-              <w:t>0.3656</w:t>
+              <w:t>0.3633</w:t>
             </w:r>
           </w:p>
         </w:tc>
@@ -3289,7 +3289,7 @@
           <w:i w:val="0"/>
           <w:sz w:val="20"/>
         </w:rPr>
-        <w:t>, selected by validation F1 at threshold 0.50: logistic regression 0.3694; random forest 0.4658; histogram GB 0.4682; XGBoost 0.4598. The F1 values were distinct, so the cost tie-break was not used. Strategy B minimizes validation cost over models and thresholds. Histogram GB denotes histogram gradient boosting.</w:t>
+        <w:t>, selected by validation F1 at threshold 0.50: logistic regression 0.3694; random forest 0.4658; histogram GB 0.4685; XGBoost 0.4688. The F1 values were distinct, so the cost tie-break was not used. Strategy B minimizes validation cost over models and thresholds. Histogram GB denotes histogram gradient boosting.</w:t>
       </w:r>
     </w:p>
     <w:p>
@@ -3304,7 +3304,7 @@
           <w:i w:val="0"/>
           <w:sz w:val="24"/>
         </w:rPr>
-        <w:t xml:space="preserve">The larger change is the threshold, not the selector (Table 2 and Figure 2). For the prediction-first model, test cost at threshold 0.50 versus the tuned threshold moves from 0.3272 to 0.3163 at </w:t>
+        <w:t xml:space="preserve">The larger change is the threshold, not the selector (Table 2 and Figure 2). For the prediction-first model, test cost at threshold 0.50 versus the tuned threshold moves from 0.3253 to 0.3122 at </w:t>
       </w:r>
       <w:r>
         <w:rPr>
@@ -3322,7 +3322,7 @@
           <w:i w:val="0"/>
           <w:sz w:val="24"/>
         </w:rPr>
-        <w:t xml:space="preserve"> = 2, from 0.7522 to 0.5762 at </w:t>
+        <w:t xml:space="preserve"> = 2, from 0.7503 to 0.5755 at </w:t>
       </w:r>
       <w:r>
         <w:rPr>
@@ -3340,7 +3340,7 @@
           <w:i w:val="0"/>
           <w:sz w:val="24"/>
         </w:rPr>
-        <w:t xml:space="preserve"> = 5, from 1.4605 to 0.7392 at </w:t>
+        <w:t xml:space="preserve"> = 5, from 1.4587 to 0.7230 at </w:t>
       </w:r>
       <w:r>
         <w:rPr>
@@ -3358,7 +3358,7 @@
           <w:i w:val="0"/>
           <w:sz w:val="24"/>
         </w:rPr>
-        <w:t xml:space="preserve"> = 10, and from 2.8772 to 0.7815 at </w:t>
+        <w:t xml:space="preserve"> = 10, and from 2.8753 to 0.7775 at </w:t>
       </w:r>
       <w:r>
         <w:rPr>
@@ -3376,7 +3376,7 @@
           <w:i w:val="0"/>
           <w:sz w:val="24"/>
         </w:rPr>
-        <w:t xml:space="preserve"> = 20. The seed-42 interval includes zero at </w:t>
+        <w:t xml:space="preserve"> = 20. Every seed-42 interval for that threshold contrast excludes zero. The strategy gap is smaller. At </w:t>
       </w:r>
       <w:r>
         <w:rPr>
@@ -3394,7 +3394,7 @@
           <w:i w:val="0"/>
           <w:sz w:val="24"/>
         </w:rPr>
-        <w:t xml:space="preserve"> = 2, so that difference is not statistically conclusive, and excludes zero at the three higher ratios. The strategy gap is smaller. At </w:t>
+        <w:t xml:space="preserve"> = 2, decision-first selection reaches test cost 0.3035 and prediction-first selection reaches 0.3122. The relative difference is 0.0278. The 95% interval for the cost difference is 0.0015 to 0.0162 and excludes zero. At </w:t>
       </w:r>
       <w:r>
         <w:rPr>
@@ -3412,25 +3412,7 @@
           <w:i w:val="0"/>
           <w:sz w:val="24"/>
         </w:rPr>
-        <w:t xml:space="preserve"> = 2, decision-first selection reaches test cost 0.3035 and prediction-first selection reaches 0.3163. The relative difference is 0.0406. The 95% interval for the cost difference is 0.0050 to 0.0210 and excludes zero. At </w:t>
-      </w:r>
-      <w:r>
-        <w:rPr>
-          <w:rFonts w:ascii="Times New Roman" w:hAnsi="Times New Roman" w:cs="Times New Roman" w:eastAsia="Times New Roman"/>
-          <w:b w:val="0"/>
-          <w:i/>
-          <w:sz w:val="24"/>
-        </w:rPr>
-        <w:t>r</w:t>
-      </w:r>
-      <w:r>
-        <w:rPr>
-          <w:rFonts w:ascii="Times New Roman" w:hAnsi="Times New Roman" w:cs="Times New Roman" w:eastAsia="Times New Roman"/>
-          <w:b w:val="0"/>
-          <w:i w:val="0"/>
-          <w:sz w:val="24"/>
-        </w:rPr>
-        <w:t xml:space="preserve"> = 5, the prediction-first cost is slightly lower (0.5762 versus 0.5788; relative difference −0.0046). The interval includes zero, and the difference is not statistically conclusive. At </w:t>
+        <w:t xml:space="preserve"> = 5 the two strategies select the same model and the same threshold, so the cost difference is zero and the interval is [0.0000, 0.0000]. At </w:t>
       </w:r>
       <w:r>
         <w:rPr>
@@ -3466,7 +3448,7 @@
           <w:i w:val="0"/>
           <w:sz w:val="24"/>
         </w:rPr>
-        <w:t xml:space="preserve"> = 20 the point estimates favor decision-first selection (relative differences 0.0401 and 0.0077), but both intervals include zero. Those differences are not statistically conclusive. Decision-first selection is therefore not uniformly cheaper on this file.</w:t>
+        <w:t xml:space="preserve"> = 20 the point estimates favor decision-first selection (relative differences 0.0187 and 0.0026), but both intervals include zero. Those two differences are not statistically conclusive. Decision-first selection is therefore not uniformly cheaper on this file.</w:t>
       </w:r>
     </w:p>
     <w:p>
@@ -3770,7 +3752,7 @@
                 <w:i w:val="0"/>
                 <w:sz w:val="20"/>
               </w:rPr>
-              <w:t>histogram GB</w:t>
+              <w:t>XGBoost</w:t>
             </w:r>
           </w:p>
         </w:tc>
@@ -3836,7 +3818,7 @@
                 <w:i w:val="0"/>
                 <w:sz w:val="20"/>
               </w:rPr>
-              <w:t>0.3163</w:t>
+              <w:t>0.3122</w:t>
             </w:r>
           </w:p>
         </w:tc>
@@ -4039,7 +4021,7 @@
                 <w:i w:val="0"/>
                 <w:sz w:val="18"/>
               </w:rPr>
-              <w:t>(A−B)/A = 0.0406. Cost difference A−B = 0.0128, 95% CI [0.0050, 0.0210], includes zero: no.</w:t>
+              <w:t>(A−B)/A = 0.0278. Cost difference A−B = 0.0087, 95% CI [0.0015, 0.0162], includes zero: no.</w:t>
             </w:r>
           </w:p>
         </w:tc>
@@ -4140,7 +4122,7 @@
                 <w:i w:val="0"/>
                 <w:sz w:val="20"/>
               </w:rPr>
-              <w:t>histogram GB</w:t>
+              <w:t>XGBoost</w:t>
             </w:r>
           </w:p>
         </w:tc>
@@ -4173,7 +4155,7 @@
                 <w:i w:val="0"/>
                 <w:sz w:val="20"/>
               </w:rPr>
-              <w:t>0.16</w:t>
+              <w:t>0.15</w:t>
             </w:r>
           </w:p>
         </w:tc>
@@ -4206,7 +4188,7 @@
                 <w:i w:val="0"/>
                 <w:sz w:val="20"/>
               </w:rPr>
-              <w:t>0.5762</w:t>
+              <w:t>0.5755</w:t>
             </w:r>
           </w:p>
         </w:tc>
@@ -4340,7 +4322,7 @@
                 <w:i w:val="0"/>
                 <w:sz w:val="20"/>
               </w:rPr>
-              <w:t>0.16</w:t>
+              <w:t>0.15</w:t>
             </w:r>
           </w:p>
         </w:tc>
@@ -4373,7 +4355,7 @@
                 <w:i w:val="0"/>
                 <w:sz w:val="20"/>
               </w:rPr>
-              <w:t>0.5788</w:t>
+              <w:t>0.5755</w:t>
             </w:r>
           </w:p>
         </w:tc>
@@ -4409,7 +4391,7 @@
                 <w:i w:val="0"/>
                 <w:sz w:val="18"/>
               </w:rPr>
-              <w:t>(A−B)/A = −0.0046. Cost difference A−B = −0.0027, 95% CI [−0.0202, 0.0147], includes zero: yes.</w:t>
+              <w:t>(A−B)/A = 0.0000. Cost difference A−B = 0.0000, 95% CI [0.0000, 0.0000], includes zero: yes.</w:t>
             </w:r>
           </w:p>
         </w:tc>
@@ -4510,7 +4492,7 @@
                 <w:i w:val="0"/>
                 <w:sz w:val="20"/>
               </w:rPr>
-              <w:t>histogram GB</w:t>
+              <w:t>XGBoost</w:t>
             </w:r>
           </w:p>
         </w:tc>
@@ -4576,7 +4558,7 @@
                 <w:i w:val="0"/>
                 <w:sz w:val="20"/>
               </w:rPr>
-              <w:t>0.7392</w:t>
+              <w:t>0.7230</w:t>
             </w:r>
           </w:p>
         </w:tc>
@@ -4779,7 +4761,7 @@
                 <w:i w:val="0"/>
                 <w:sz w:val="18"/>
               </w:rPr>
-              <w:t>(A−B)/A = 0.0401. Cost difference A−B = 0.0297, 95% CI [−0.0023, 0.0655], includes zero: yes.</w:t>
+              <w:t>(A−B)/A = 0.0187. Cost difference A−B = 0.0135, 95% CI [−0.0158, 0.0453], includes zero: yes.</w:t>
             </w:r>
           </w:p>
         </w:tc>
@@ -4880,7 +4862,7 @@
                 <w:i w:val="0"/>
                 <w:sz w:val="20"/>
               </w:rPr>
-              <w:t>histogram GB</w:t>
+              <w:t>XGBoost</w:t>
             </w:r>
           </w:p>
         </w:tc>
@@ -4946,7 +4928,7 @@
                 <w:i w:val="0"/>
                 <w:sz w:val="20"/>
               </w:rPr>
-              <w:t>0.7815</w:t>
+              <w:t>0.7775</w:t>
             </w:r>
           </w:p>
         </w:tc>
@@ -5149,7 +5131,7 @@
                 <w:i w:val="0"/>
                 <w:sz w:val="18"/>
               </w:rPr>
-              <w:t>(A−B)/A = 0.0077. Cost difference A−B = 0.0060, 95% CI [−0.0168, 0.0272], includes zero: yes.</w:t>
+              <w:t>(A−B)/A = 0.0026. Cost difference A−B = 0.0020, 95% CI [−0.0212, 0.0228], includes zero: yes.</w:t>
             </w:r>
           </w:p>
         </w:tc>
@@ -5167,7 +5149,7 @@
           <w:i w:val="0"/>
           <w:sz w:val="20"/>
         </w:rPr>
-        <w:t xml:space="preserve">For the prediction-first model (histogram GB), test cost at threshold 0.50 versus the cost-tuned threshold: </w:t>
+        <w:t xml:space="preserve">For the prediction-first model (XGBoost), test cost at threshold 0.50 versus the cost-tuned threshold: </w:t>
       </w:r>
       <w:r>
         <w:rPr>
@@ -5185,7 +5167,7 @@
           <w:i w:val="0"/>
           <w:sz w:val="20"/>
         </w:rPr>
-        <w:t xml:space="preserve"> = 2, 0.3272 versus 0.3163; </w:t>
+        <w:t xml:space="preserve"> = 2, 0.3253 versus 0.3122; </w:t>
       </w:r>
       <w:r>
         <w:rPr>
@@ -5203,7 +5185,7 @@
           <w:i w:val="0"/>
           <w:sz w:val="20"/>
         </w:rPr>
-        <w:t xml:space="preserve"> = 5, 0.7522 versus 0.5762; </w:t>
+        <w:t xml:space="preserve"> = 5, 0.7503 versus 0.5755; </w:t>
       </w:r>
       <w:r>
         <w:rPr>
@@ -5221,7 +5203,7 @@
           <w:i w:val="0"/>
           <w:sz w:val="20"/>
         </w:rPr>
-        <w:t xml:space="preserve"> = 10, 1.4605 versus 0.7392; </w:t>
+        <w:t xml:space="preserve"> = 10, 1.4587 versus 0.7230; </w:t>
       </w:r>
       <w:r>
         <w:rPr>
@@ -5239,7 +5221,7 @@
           <w:i w:val="0"/>
           <w:sz w:val="20"/>
         </w:rPr>
-        <w:t xml:space="preserve"> = 20, 2.8772 versus 0.7815. Paired bootstrap 95% CIs for (cost at 0.50 minus cost at the tuned threshold) are </w:t>
+        <w:t xml:space="preserve"> = 20, 2.8753 versus 0.7775. Paired bootstrap 95% CIs for (cost at 0.50 minus cost at the tuned threshold) are </w:t>
       </w:r>
       <w:r>
         <w:rPr>
@@ -5257,7 +5239,7 @@
           <w:i w:val="0"/>
           <w:sz w:val="20"/>
         </w:rPr>
-        <w:t xml:space="preserve"> = 2, [−0.0008, 0.0227], includes zero: yes; </w:t>
+        <w:t xml:space="preserve"> = 2, [0.0017, 0.0240], includes zero: no; </w:t>
       </w:r>
       <w:r>
         <w:rPr>
@@ -5275,7 +5257,7 @@
           <w:i w:val="0"/>
           <w:sz w:val="20"/>
         </w:rPr>
-        <w:t xml:space="preserve"> = 5, [0.1370, 0.2147], includes zero: no; </w:t>
+        <w:t xml:space="preserve"> = 5, [0.1338, 0.2150], includes zero: no; </w:t>
       </w:r>
       <w:r>
         <w:rPr>
@@ -5293,7 +5275,7 @@
           <w:i w:val="0"/>
           <w:sz w:val="20"/>
         </w:rPr>
-        <w:t xml:space="preserve"> = 10, [0.6297, 0.8035], includes zero: no; </w:t>
+        <w:t xml:space="preserve"> = 10, [0.6447, 0.8177], includes zero: no; </w:t>
       </w:r>
       <w:r>
         <w:rPr>
@@ -5311,7 +5293,7 @@
           <w:i w:val="0"/>
           <w:sz w:val="20"/>
         </w:rPr>
-        <w:t xml:space="preserve"> = 20, [1.9144, 2.2858], includes zero: no. Across seeds 42 through 61 (20 splits), prediction-first test cost min, median, and max were </w:t>
+        <w:t xml:space="preserve"> = 20, [1.9196, 2.2774], includes zero: no. Across seeds 42 through 61 (20 splits), prediction-first test cost min, median, and max were </w:t>
       </w:r>
       <w:r>
         <w:rPr>
@@ -5329,7 +5311,7 @@
           <w:i w:val="0"/>
           <w:sz w:val="20"/>
         </w:rPr>
-        <w:t xml:space="preserve"> = 2, 0.2917, 0.3052, 0.3175; </w:t>
+        <w:t xml:space="preserve"> = 2, 0.2935, 0.3053, 0.3122; </w:t>
       </w:r>
       <w:r>
         <w:rPr>
@@ -5347,7 +5329,7 @@
           <w:i w:val="0"/>
           <w:sz w:val="20"/>
         </w:rPr>
-        <w:t xml:space="preserve"> = 5, 0.5253, 0.5617, 0.5762; </w:t>
+        <w:t xml:space="preserve"> = 5, 0.5363, 0.5570, 0.5843; </w:t>
       </w:r>
       <w:r>
         <w:rPr>
@@ -5365,7 +5347,7 @@
           <w:i w:val="0"/>
           <w:sz w:val="20"/>
         </w:rPr>
-        <w:t xml:space="preserve"> = 10, 0.6668, 0.7163, 0.7472; </w:t>
+        <w:t xml:space="preserve"> = 10, 0.6682, 0.7114, 0.7560; </w:t>
       </w:r>
       <w:r>
         <w:rPr>
@@ -5383,7 +5365,7 @@
           <w:i w:val="0"/>
           <w:sz w:val="20"/>
         </w:rPr>
-        <w:t xml:space="preserve"> = 20, 0.7673, 0.7792, 0.8660. Cost at threshold 0.50 min, median, and max were </w:t>
+        <w:t xml:space="preserve"> = 20, 0.7557, 0.7784, 0.8418. Cost at threshold 0.50 min, median, and max were </w:t>
       </w:r>
       <w:r>
         <w:rPr>
@@ -5401,7 +5383,7 @@
           <w:i w:val="0"/>
           <w:sz w:val="20"/>
         </w:rPr>
-        <w:t xml:space="preserve"> = 2, 0.3122, 0.3196, 0.3300; </w:t>
+        <w:t xml:space="preserve"> = 2, 0.3100, 0.3193, 0.3373; </w:t>
       </w:r>
       <w:r>
         <w:rPr>
@@ -5419,7 +5401,7 @@
           <w:i w:val="0"/>
           <w:sz w:val="20"/>
         </w:rPr>
-        <w:t xml:space="preserve"> = 5, 0.7212, 0.7372, 0.7655; </w:t>
+        <w:t xml:space="preserve"> = 5, 0.7140, 0.7383, 0.7798; </w:t>
       </w:r>
       <w:r>
         <w:rPr>
@@ -5437,7 +5419,7 @@
           <w:i w:val="0"/>
           <w:sz w:val="20"/>
         </w:rPr>
-        <w:t xml:space="preserve"> = 10, 1.4002, 1.4343, 1.4913; </w:t>
+        <w:t xml:space="preserve"> = 10, 1.3873, 1.4358, 1.5173; </w:t>
       </w:r>
       <w:r>
         <w:rPr>
@@ -5455,7 +5437,7 @@
           <w:i w:val="0"/>
           <w:sz w:val="20"/>
         </w:rPr>
-        <w:t xml:space="preserve"> = 20, 2.7552, 2.8276, 2.9430. Decision-first test cost min, median, and max were </w:t>
+        <w:t xml:space="preserve"> = 20, 2.7340, 2.8331, 2.9923. Decision-first test cost min, median, and max were </w:t>
       </w:r>
       <w:r>
         <w:rPr>
@@ -5473,7 +5455,7 @@
           <w:i w:val="0"/>
           <w:sz w:val="20"/>
         </w:rPr>
-        <w:t xml:space="preserve"> = 2, 0.2930, 0.3035, 0.3143; </w:t>
+        <w:t xml:space="preserve"> = 2, 0.2930, 0.3038, 0.3143; </w:t>
       </w:r>
       <w:r>
         <w:rPr>
@@ -5491,7 +5473,7 @@
           <w:i w:val="0"/>
           <w:sz w:val="20"/>
         </w:rPr>
-        <w:t xml:space="preserve"> = 5, 0.5435, 0.5581, 0.5880; </w:t>
+        <w:t xml:space="preserve"> = 5, 0.5435, 0.5560, 0.5882; </w:t>
       </w:r>
       <w:r>
         <w:rPr>
@@ -5509,7 +5491,7 @@
           <w:i w:val="0"/>
           <w:sz w:val="20"/>
         </w:rPr>
-        <w:t xml:space="preserve"> = 10, 0.6625, 0.7038, 0.7457; </w:t>
+        <w:t xml:space="preserve"> = 10, 0.6625, 0.7038, 0.7312; </w:t>
       </w:r>
       <w:r>
         <w:rPr>
@@ -5527,79 +5509,7 @@
           <w:i w:val="0"/>
           <w:sz w:val="20"/>
         </w:rPr>
-        <w:t xml:space="preserve"> = 20, 0.7523, 0.7654, 0.7965. Tuned cost was lower on 19 of 20 splits at </w:t>
-      </w:r>
-      <w:r>
-        <w:rPr>
-          <w:rFonts w:ascii="Times New Roman" w:hAnsi="Times New Roman" w:cs="Times New Roman" w:eastAsia="Times New Roman"/>
-          <w:b w:val="0"/>
-          <w:i/>
-          <w:sz w:val="20"/>
-        </w:rPr>
-        <w:t>r</w:t>
-      </w:r>
-      <w:r>
-        <w:rPr>
-          <w:rFonts w:ascii="Times New Roman" w:hAnsi="Times New Roman" w:cs="Times New Roman" w:eastAsia="Times New Roman"/>
-          <w:b w:val="0"/>
-          <w:i w:val="0"/>
-          <w:sz w:val="20"/>
-        </w:rPr>
-        <w:t xml:space="preserve"> = 2 and on 20 of 20 splits at </w:t>
-      </w:r>
-      <w:r>
-        <w:rPr>
-          <w:rFonts w:ascii="Times New Roman" w:hAnsi="Times New Roman" w:cs="Times New Roman" w:eastAsia="Times New Roman"/>
-          <w:b w:val="0"/>
-          <w:i/>
-          <w:sz w:val="20"/>
-        </w:rPr>
-        <w:t>r</w:t>
-      </w:r>
-      <w:r>
-        <w:rPr>
-          <w:rFonts w:ascii="Times New Roman" w:hAnsi="Times New Roman" w:cs="Times New Roman" w:eastAsia="Times New Roman"/>
-          <w:b w:val="0"/>
-          <w:i w:val="0"/>
-          <w:sz w:val="20"/>
-        </w:rPr>
-        <w:t xml:space="preserve"> = 5, </w:t>
-      </w:r>
-      <w:r>
-        <w:rPr>
-          <w:rFonts w:ascii="Times New Roman" w:hAnsi="Times New Roman" w:cs="Times New Roman" w:eastAsia="Times New Roman"/>
-          <w:b w:val="0"/>
-          <w:i/>
-          <w:sz w:val="20"/>
-        </w:rPr>
-        <w:t>r</w:t>
-      </w:r>
-      <w:r>
-        <w:rPr>
-          <w:rFonts w:ascii="Times New Roman" w:hAnsi="Times New Roman" w:cs="Times New Roman" w:eastAsia="Times New Roman"/>
-          <w:b w:val="0"/>
-          <w:i w:val="0"/>
-          <w:sz w:val="20"/>
-        </w:rPr>
-        <w:t xml:space="preserve"> = 10, and </w:t>
-      </w:r>
-      <w:r>
-        <w:rPr>
-          <w:rFonts w:ascii="Times New Roman" w:hAnsi="Times New Roman" w:cs="Times New Roman" w:eastAsia="Times New Roman"/>
-          <w:b w:val="0"/>
-          <w:i/>
-          <w:sz w:val="20"/>
-        </w:rPr>
-        <w:t>r</w:t>
-      </w:r>
-      <w:r>
-        <w:rPr>
-          <w:rFonts w:ascii="Times New Roman" w:hAnsi="Times New Roman" w:cs="Times New Roman" w:eastAsia="Times New Roman"/>
-          <w:b w:val="0"/>
-          <w:i w:val="0"/>
-          <w:sz w:val="20"/>
-        </w:rPr>
-        <w:t xml:space="preserve"> = 20. Decision-first test cost was strictly lower on 13, 7, 13, and 17 of 20 splits. These ranges are not a confidence interval.</w:t>
+        <w:t xml:space="preserve"> = 20, 0.7437, 0.7713, 0.7965. Tuned cost was lower on 20 of 20 splits at every ratio. Decision-first test cost was strictly lower on 8, 6, 17, and 12 of 20 splits. These ranges are not a confidence interval.</w:t>
       </w:r>
     </w:p>
     <w:p>
@@ -5632,7 +5542,7 @@
           <w:i w:val="0"/>
           <w:sz w:val="24"/>
         </w:rPr>
-        <w:t xml:space="preserve">) at the first three ratios: 0.31 and 0.30 against 0.33, 0.16 and 0.16 against 0.17, and 0.09 and 0.10 against 0.09. At </w:t>
+        <w:t xml:space="preserve">) at the first three ratios: 0.31 and 0.30 against 0.33, 0.15 against 0.17, and 0.09 and 0.10 against 0.09. At </w:t>
       </w:r>
       <w:r>
         <w:rPr>
@@ -5650,7 +5560,7 @@
           <w:i w:val="0"/>
           <w:sz w:val="24"/>
         </w:rPr>
-        <w:t xml:space="preserve"> = 20 the reference is 0.05, but prediction-first selection stops at 0.01, also on 6 of the 20 splits. The 0.001 to 0.009 grid moves seed 42 from 0.01 to 0.009 (validation cost 0.7718, against 0.7728; test cost 0.7835, against 0.7815). Validation cost improves and test cost does not, so the threshold stays locked before the test accounts are scored. Prediction-first selection moves below 0.01 on 9 of the 20 splits; decision-first selection stays at 0.06 on the seed-42 split and moves below 0.01 on 1 of the 20 splits.</w:t>
+        <w:t xml:space="preserve"> = 20 the reference is 0.05, but prediction-first selection stops at 0.01, also on 5 of the 20 splits. The 0.001 to 0.009 grid moves the seed-42 prediction-first threshold from 0.01 to 0.009 (validation cost 0.7755, against 0.7778; test cost 0.7788, against 0.7775). Validation cost improves and test cost does not, so the threshold stays locked before the test accounts are scored.</w:t>
       </w:r>
     </w:p>
     <w:p>
@@ -5665,7 +5575,7 @@
           <w:i w:val="0"/>
           <w:sz w:val="24"/>
         </w:rPr>
-        <w:t xml:space="preserve">Across seeds 42 through 61, the prediction-first model was histogram gradient boosting on 12 splits, XGBoost on 6, and the random forest on 2. No split used the cost tie-break. Prediction-first thresholds ranged from 0.30 to 0.38 at </w:t>
+        <w:t xml:space="preserve">Across seeds 42 through 61, the prediction-first model did not change with the cost ratio on any split. It was XGBoost on 10 splits, histogram gradient boosting on 9, and the random forest on 1. Prediction-first thresholds ranged from 0.29 to 0.37 at </w:t>
       </w:r>
       <w:r>
         <w:rPr>
@@ -5683,7 +5593,7 @@
           <w:i w:val="0"/>
           <w:sz w:val="24"/>
         </w:rPr>
-        <w:t xml:space="preserve"> = 2, 0.13 to 0.22 at </w:t>
+        <w:t xml:space="preserve"> = 2, 0.14 to 0.20 at </w:t>
       </w:r>
       <w:r>
         <w:rPr>
@@ -5701,7 +5611,7 @@
           <w:i w:val="0"/>
           <w:sz w:val="24"/>
         </w:rPr>
-        <w:t xml:space="preserve"> = 5, 0.05 to 0.10 at </w:t>
+        <w:t xml:space="preserve"> = 5, 0.06 to 0.10 at </w:t>
       </w:r>
       <w:r>
         <w:rPr>
@@ -5737,7 +5647,7 @@
           <w:i w:val="0"/>
           <w:sz w:val="24"/>
         </w:rPr>
-        <w:t xml:space="preserve"> = 20. Decision-first selection chose the random forest on 18, 12, 17, and 18 of the 20 splits. Prediction-first test cost was strictly lower on 5, 10, 4, and 1 of the 20 splits, with 2, 3, 3, and 2 ties. The mean gain from leaving threshold 0.50 was 0.0145, 0.1797, 0.7184, and 2.0446, with intervals [0.0118, 0.0170], [0.1739, 0.1852], [0.7043, 0.7324], and [2.0173, 2.0735]. None included zero. The mean strategy gap, prediction-first cost minus decision-first cost, was 0.0028, −0.0006, 0.0157, and 0.0196, with intervals [0.0013, 0.0047], [−0.0055, 0.0040], [0.0083, 0.0242], and [0.0110, 0.0297]. Only the ratio-5 interval included zero. At ratios 5, 10, and 20 the operating threshold accounts for an order of magnitude more of the cost improvement than the choice between the two selection rules. This describes partition stability on one file, not independent replication.</w:t>
+        <w:t xml:space="preserve"> = 20. Decision-first selection chose the random forest on 15, 10, 14, and 14 of the 20 splits. Prediction-first test cost was strictly lower on 6, 6, 0, and 4 of the 20 splits, with 6, 8, 3, and 4 ties. The mean gain from leaving threshold 0.50 was 0.0157, 0.1815, 0.7236, and 2.0551, with intervals [0.0133, 0.0183], [0.1737, 0.1895], [0.7083, 0.7390], and [2.0258, 2.0863]. None included zero. The mean strategy gap, prediction-first cost minus decision-first cost, was 0.0010, −0.0001, 0.0143, and 0.0104, with intervals [−0.0006, 0.0028], [−0.0028, 0.0024], [0.0100, 0.0188], and [0.0033, 0.0189]. The ratio-2 and ratio-5 intervals included zero. At ratios 5, 10, and 20 the operating threshold accounts for an order of magnitude more of the cost improvement than the choice between the two selection rules. This describes partition stability on one file, not independent replication.</w:t>
       </w:r>
     </w:p>
     <w:p>
@@ -5749,7 +5659,7 @@
       <w:r>
         <w:drawing>
           <wp:inline xmlns:a="http://schemas.openxmlformats.org/drawingml/2006/main" xmlns:pic="http://schemas.openxmlformats.org/drawingml/2006/picture">
-            <wp:extent cx="5852160" cy="4914951"/>
+            <wp:extent cx="5852160" cy="4918581"/>
             <wp:docPr id="1" name="Picture 1"/>
             <wp:cNvGraphicFramePr>
               <a:graphicFrameLocks noChangeAspect="1"/>
@@ -5770,7 +5680,7 @@
                   <pic:spPr>
                     <a:xfrm>
                       <a:off x="0" y="0"/>
-                      <a:ext cx="5852160" cy="4914951"/>
+                      <a:ext cx="5852160" cy="4918581"/>
                     </a:xfrm>
                     <a:prstGeom prst="rect"/>
                   </pic:spPr>
@@ -5813,7 +5723,7 @@
       <w:r>
         <w:drawing>
           <wp:inline xmlns:a="http://schemas.openxmlformats.org/drawingml/2006/main" xmlns:pic="http://schemas.openxmlformats.org/drawingml/2006/picture">
-            <wp:extent cx="5852160" cy="5311495"/>
+            <wp:extent cx="5852160" cy="5307169"/>
             <wp:docPr id="2" name="Picture 2"/>
             <wp:cNvGraphicFramePr>
               <a:graphicFrameLocks noChangeAspect="1"/>
@@ -5834,7 +5744,7 @@
                   <pic:spPr>
                     <a:xfrm>
                       <a:off x="0" y="0"/>
-                      <a:ext cx="5852160" cy="5311495"/>
+                      <a:ext cx="5852160" cy="5307169"/>
                     </a:xfrm>
                     <a:prstGeom prst="rect"/>
                   </pic:spPr>
@@ -6072,7 +5982,7 @@
           <w:i w:val="0"/>
           <w:sz w:val="24"/>
         </w:rPr>
-        <w:t xml:space="preserve">Under these asymmetric costs, the operating threshold accounts for more of the cost improvement than the choice among these classifiers. On the seed-42 test set, leaving threshold 0.50 reduced cost by a margin whose interval excluded zero at </w:t>
+        <w:t xml:space="preserve">Under these asymmetric costs, the operating threshold accounts for more of the cost improvement than the choice among these classifiers. On the seed-42 test set, leaving threshold 0.50 reduced cost by a margin whose interval excluded zero at every ratio. The strategy difference excluded zero only at </w:t>
       </w:r>
       <w:r>
         <w:rPr>
@@ -6090,7 +6000,7 @@
           <w:i w:val="0"/>
           <w:sz w:val="24"/>
         </w:rPr>
-        <w:t xml:space="preserve"> = 5, </w:t>
+        <w:t xml:space="preserve"> = 2. At </w:t>
       </w:r>
       <w:r>
         <w:rPr>
@@ -6108,7 +6018,7 @@
           <w:i w:val="0"/>
           <w:sz w:val="24"/>
         </w:rPr>
-        <w:t xml:space="preserve"> = 10, and </w:t>
+        <w:t xml:space="preserve"> = 5 the two strategies selected the same rule, so the difference was zero. At </w:t>
       </w:r>
       <w:r>
         <w:rPr>
@@ -6126,7 +6036,7 @@
           <w:i w:val="0"/>
           <w:sz w:val="24"/>
         </w:rPr>
-        <w:t xml:space="preserve"> = 20, and the strategy difference was not statistically conclusive at those three ratios. At </w:t>
+        <w:t xml:space="preserve"> = 10 and </w:t>
       </w:r>
       <w:r>
         <w:rPr>
@@ -6144,7 +6054,7 @@
           <w:i w:val="0"/>
           <w:sz w:val="24"/>
         </w:rPr>
-        <w:t xml:space="preserve"> = 5 the point estimate favored prediction-first selection. Across seeds 42 through 61, the mean gain from leaving 0.50 excluded zero at every ratio, including </w:t>
+        <w:t xml:space="preserve"> = 20 the strategy intervals included zero. Across seeds 42 through 61, the mean gain from leaving 0.50 excluded zero at every ratio, and the mean strategy gap included zero at </w:t>
       </w:r>
       <w:r>
         <w:rPr>
@@ -6162,7 +6072,7 @@
           <w:i w:val="0"/>
           <w:sz w:val="24"/>
         </w:rPr>
-        <w:t xml:space="preserve"> = 2, where the seed-42 test interval still included zero. Those are different questions, and the min-to-max range is not a confidence interval. Extending the </w:t>
+        <w:t xml:space="preserve"> = 2 and </w:t>
       </w:r>
       <w:r>
         <w:rPr>
@@ -6180,7 +6090,25 @@
           <w:i w:val="0"/>
           <w:sz w:val="24"/>
         </w:rPr>
-        <w:t xml:space="preserve"> = 20 grid to 0.009 did not lower seed-42 test cost. The validation Brier scores are close, which is not a calibration proof. SEX was excluded from the predictors, was not used to estimate a sex effect, and that exclusion does not establish fairness.</w:t>
+        <w:t xml:space="preserve"> = 5. Those are different questions, and the min-to-max range is not a confidence interval. Extending the </w:t>
+      </w:r>
+      <w:r>
+        <w:rPr>
+          <w:rFonts w:ascii="Times New Roman" w:hAnsi="Times New Roman" w:cs="Times New Roman" w:eastAsia="Times New Roman"/>
+          <w:b w:val="0"/>
+          <w:i/>
+          <w:sz w:val="24"/>
+        </w:rPr>
+        <w:t>r</w:t>
+      </w:r>
+      <w:r>
+        <w:rPr>
+          <w:rFonts w:ascii="Times New Roman" w:hAnsi="Times New Roman" w:cs="Times New Roman" w:eastAsia="Times New Roman"/>
+          <w:b w:val="0"/>
+          <w:i w:val="0"/>
+          <w:sz w:val="24"/>
+        </w:rPr>
+        <w:t xml:space="preserve"> = 20 grid to 0.009 lowered validation cost and did not lower seed-42 test cost. The validation Brier scores are close, which is not a calibration proof. SEX was excluded from the predictors, was not used to estimate a sex effect, and that exclusion does not establish fairness.</w:t>
       </w:r>
     </w:p>
     <w:p>

</xml_diff>